<commit_message>
add: add minhchung docker part1
</commit_message>
<xml_diff>
--- a/week04_layer_microkernel_docker/22638121_TranCongMinh_Week04_MinhChung.docx
+++ b/week04_layer_microkernel_docker/22638121_TranCongMinh_Week04_MinhChung.docx
@@ -4,11 +4,35 @@
   <w:body>
     <w:p>
       <w:pPr>
-        <w:rPr>
-          <w:lang w:val="en-US"/>
-        </w:rPr>
-      </w:pPr>
-      <w:r>
+        <w:pStyle w:val="Heading1"/>
+        <w:numPr>
+          <w:ilvl w:val="0"/>
+          <w:numId w:val="18"/>
+        </w:numPr>
+        <w:rPr>
+          <w:noProof/>
+          <w:lang w:val="en-US"/>
+        </w:rPr>
+      </w:pPr>
+      <w:r>
+        <w:rPr>
+          <w:noProof/>
+          <w:lang w:val="en-US"/>
+        </w:rPr>
+        <w:t>CMS System</w:t>
+      </w:r>
+    </w:p>
+    <w:p>
+      <w:pPr>
+        <w:pStyle w:val="NoSpacing"/>
+        <w:rPr>
+          <w:lang w:val="en-US"/>
+        </w:rPr>
+      </w:pPr>
+      <w:r>
+        <w:rPr>
+          <w:noProof/>
+        </w:rPr>
         <w:drawing>
           <wp:inline distT="0" distB="0" distL="0" distR="0" wp14:anchorId="3CBA06EC" wp14:editId="14E94BDB">
             <wp:extent cx="7315200" cy="2840990"/>
@@ -25,7 +49,7 @@
                     <pic:cNvPicPr/>
                   </pic:nvPicPr>
                   <pic:blipFill>
-                    <a:blip r:embed="rId5"/>
+                    <a:blip r:embed="rId6"/>
                     <a:stretch>
                       <a:fillRect/>
                     </a:stretch>
@@ -48,35 +72,12 @@
     </w:p>
     <w:p>
       <w:pPr>
-        <w:rPr>
-          <w:rFonts w:asciiTheme="majorHAnsi" w:hAnsiTheme="majorHAnsi" w:cstheme="majorHAnsi"/>
-          <w:b/>
-          <w:bCs/>
-          <w:sz w:val="26"/>
-          <w:szCs w:val="26"/>
-          <w:lang w:val="en-US"/>
-        </w:rPr>
-      </w:pPr>
-      <w:r>
-        <w:rPr>
-          <w:rFonts w:asciiTheme="majorHAnsi" w:hAnsiTheme="majorHAnsi" w:cstheme="majorHAnsi"/>
-          <w:b/>
-          <w:bCs/>
-          <w:sz w:val="26"/>
-          <w:szCs w:val="26"/>
-          <w:lang w:val="en-US"/>
-        </w:rPr>
+        <w:pStyle w:val="Heading2"/>
+      </w:pPr>
+      <w:r>
         <w:t xml:space="preserve">Sơ đồ </w:t>
       </w:r>
       <w:r>
-        <w:rPr>
-          <w:rFonts w:asciiTheme="majorHAnsi" w:hAnsiTheme="majorHAnsi" w:cstheme="majorHAnsi"/>
-          <w:b/>
-          <w:bCs/>
-          <w:sz w:val="26"/>
-          <w:szCs w:val="26"/>
-          <w:lang w:val="en-US"/>
-        </w:rPr>
         <w:t>Layer Architecture</w:t>
       </w:r>
     </w:p>
@@ -91,6 +92,7 @@
       </w:pPr>
       <w:r>
         <w:rPr>
+          <w:noProof/>
           <w:lang w:val="en-US"/>
         </w:rPr>
         <w:drawing>
@@ -109,7 +111,7 @@
                     <pic:cNvPicPr/>
                   </pic:nvPicPr>
                   <pic:blipFill>
-                    <a:blip r:embed="rId6"/>
+                    <a:blip r:embed="rId7"/>
                     <a:stretch>
                       <a:fillRect/>
                     </a:stretch>
@@ -288,48 +290,14 @@
     </w:p>
     <w:p>
       <w:pPr>
-        <w:rPr>
-          <w:rFonts w:asciiTheme="majorHAnsi" w:hAnsiTheme="majorHAnsi" w:cstheme="majorHAnsi"/>
-          <w:b/>
-          <w:bCs/>
-          <w:sz w:val="26"/>
-          <w:szCs w:val="26"/>
-          <w:lang w:val="en-US"/>
-        </w:rPr>
-      </w:pPr>
-      <w:r>
-        <w:rPr>
-          <w:rFonts w:asciiTheme="majorHAnsi" w:hAnsiTheme="majorHAnsi" w:cstheme="majorHAnsi"/>
-          <w:b/>
-          <w:bCs/>
-          <w:sz w:val="26"/>
-          <w:szCs w:val="26"/>
-          <w:lang w:val="en-US"/>
-        </w:rPr>
+        <w:pStyle w:val="Heading2"/>
+      </w:pPr>
+      <w:r>
         <w:lastRenderedPageBreak/>
         <w:t xml:space="preserve">Sơ đồ </w:t>
       </w:r>
       <w:r>
-        <w:rPr>
-          <w:rFonts w:asciiTheme="majorHAnsi" w:hAnsiTheme="majorHAnsi" w:cstheme="majorHAnsi"/>
-          <w:b/>
-          <w:bCs/>
-          <w:sz w:val="26"/>
-          <w:szCs w:val="26"/>
-          <w:lang w:val="en-US"/>
-        </w:rPr>
-        <w:t xml:space="preserve">Microckernel </w:t>
-      </w:r>
-      <w:r>
-        <w:rPr>
-          <w:rFonts w:asciiTheme="majorHAnsi" w:hAnsiTheme="majorHAnsi" w:cstheme="majorHAnsi"/>
-          <w:b/>
-          <w:bCs/>
-          <w:sz w:val="26"/>
-          <w:szCs w:val="26"/>
-          <w:lang w:val="en-US"/>
-        </w:rPr>
-        <w:t>Architecture</w:t>
+        <w:t>Microckernel Architecture</w:t>
       </w:r>
     </w:p>
     <w:p>
@@ -482,6 +450,7 @@
       <w:r>
         <w:rPr>
           <w:rFonts w:asciiTheme="majorHAnsi" w:hAnsiTheme="majorHAnsi" w:cstheme="majorHAnsi"/>
+          <w:noProof/>
           <w:sz w:val="26"/>
           <w:szCs w:val="26"/>
           <w:lang w:val="en-US"/>
@@ -502,7 +471,7 @@
                     <pic:cNvPicPr/>
                   </pic:nvPicPr>
                   <pic:blipFill>
-                    <a:blip r:embed="rId7"/>
+                    <a:blip r:embed="rId8"/>
                     <a:stretch>
                       <a:fillRect/>
                     </a:stretch>
@@ -525,28 +494,9 @@
     </w:p>
     <w:p>
       <w:pPr>
-        <w:pStyle w:val="ListParagraph"/>
-        <w:numPr>
-          <w:ilvl w:val="0"/>
-          <w:numId w:val="11"/>
-        </w:numPr>
-        <w:rPr>
-          <w:rFonts w:asciiTheme="majorHAnsi" w:hAnsiTheme="majorHAnsi" w:cstheme="majorHAnsi"/>
-          <w:b/>
-          <w:bCs/>
-          <w:sz w:val="26"/>
-          <w:szCs w:val="26"/>
-          <w:lang w:val="en-US"/>
-        </w:rPr>
-      </w:pPr>
-      <w:r>
-        <w:rPr>
-          <w:rFonts w:asciiTheme="majorHAnsi" w:hAnsiTheme="majorHAnsi" w:cstheme="majorHAnsi"/>
-          <w:b/>
-          <w:bCs/>
-          <w:sz w:val="26"/>
-          <w:szCs w:val="26"/>
-        </w:rPr>
+        <w:pStyle w:val="Heading2"/>
+      </w:pPr>
+      <w:r>
         <w:t>So sánh Ưu/Nhược điểm</w:t>
       </w:r>
     </w:p>
@@ -1197,28 +1147,9 @@
     </w:p>
     <w:p>
       <w:pPr>
-        <w:pStyle w:val="ListParagraph"/>
-        <w:numPr>
-          <w:ilvl w:val="0"/>
-          <w:numId w:val="11"/>
-        </w:numPr>
-        <w:rPr>
-          <w:rFonts w:asciiTheme="majorHAnsi" w:hAnsiTheme="majorHAnsi" w:cstheme="majorHAnsi"/>
-          <w:b/>
-          <w:bCs/>
-          <w:sz w:val="26"/>
-          <w:szCs w:val="26"/>
-          <w:lang w:val="en-US"/>
-        </w:rPr>
-      </w:pPr>
-      <w:r>
-        <w:rPr>
-          <w:rFonts w:asciiTheme="majorHAnsi" w:hAnsiTheme="majorHAnsi" w:cstheme="majorHAnsi"/>
-          <w:b/>
-          <w:bCs/>
-          <w:sz w:val="26"/>
-          <w:szCs w:val="26"/>
-        </w:rPr>
+        <w:pStyle w:val="Heading2"/>
+      </w:pPr>
+      <w:r>
         <w:t>Lựa chọn Style thích hợp nhất cho "Plugin-based CMS" và Giải thích</w:t>
       </w:r>
     </w:p>
@@ -1391,13 +1322,2132 @@
     </w:p>
     <w:p>
       <w:pPr>
-        <w:rPr>
-          <w:rFonts w:asciiTheme="majorHAnsi" w:hAnsiTheme="majorHAnsi" w:cstheme="majorHAnsi"/>
-          <w:sz w:val="26"/>
-          <w:szCs w:val="26"/>
-          <w:lang w:val="en-US"/>
-        </w:rPr>
-      </w:pPr>
+        <w:pStyle w:val="Heading1"/>
+        <w:numPr>
+          <w:ilvl w:val="0"/>
+          <w:numId w:val="20"/>
+        </w:numPr>
+        <w:rPr>
+          <w:lang w:val="en-US"/>
+        </w:rPr>
+      </w:pPr>
+      <w:r>
+        <w:rPr>
+          <w:lang w:val="en-US"/>
+        </w:rPr>
+        <w:t>Docker file</w:t>
+      </w:r>
+    </w:p>
+    <w:p>
+      <w:pPr>
+        <w:pStyle w:val="Heading2"/>
+        <w:numPr>
+          <w:ilvl w:val="0"/>
+          <w:numId w:val="25"/>
+        </w:numPr>
+      </w:pPr>
+      <w:r>
+        <w:t>Phần 1</w:t>
+      </w:r>
+      <w:r>
+        <w:t xml:space="preserve"> </w:t>
+      </w:r>
+      <w:r>
+        <w:t>Các lệnh cơ bản thao tác với Docker</w:t>
+      </w:r>
+      <w:r>
+        <w:tab/>
+      </w:r>
+      <w:r>
+        <w:tab/>
+      </w:r>
+    </w:p>
+    <w:p>
+      <w:pPr>
+        <w:pStyle w:val="ListParagraph"/>
+        <w:numPr>
+          <w:ilvl w:val="0"/>
+          <w:numId w:val="26"/>
+        </w:numPr>
+        <w:rPr>
+          <w:rFonts w:asciiTheme="majorHAnsi" w:hAnsiTheme="majorHAnsi" w:cstheme="majorHAnsi"/>
+          <w:sz w:val="26"/>
+          <w:szCs w:val="26"/>
+          <w:lang w:val="en-US"/>
+        </w:rPr>
+      </w:pPr>
+      <w:r>
+        <w:rPr>
+          <w:rFonts w:asciiTheme="majorHAnsi" w:hAnsiTheme="majorHAnsi" w:cstheme="majorHAnsi"/>
+          <w:sz w:val="26"/>
+          <w:szCs w:val="26"/>
+          <w:lang w:val="en-US"/>
+        </w:rPr>
+        <w:t xml:space="preserve">docker </w:t>
+      </w:r>
+      <w:r>
+        <w:rPr>
+          <w:rFonts w:asciiTheme="majorHAnsi" w:hAnsiTheme="majorHAnsi" w:cstheme="majorHAnsi"/>
+          <w:sz w:val="26"/>
+          <w:szCs w:val="26"/>
+          <w:lang w:val="en-US"/>
+        </w:rPr>
+        <w:t>–</w:t>
+      </w:r>
+      <w:r>
+        <w:rPr>
+          <w:rFonts w:asciiTheme="majorHAnsi" w:hAnsiTheme="majorHAnsi" w:cstheme="majorHAnsi"/>
+          <w:sz w:val="26"/>
+          <w:szCs w:val="26"/>
+          <w:lang w:val="en-US"/>
+        </w:rPr>
+        <w:t>version</w:t>
+      </w:r>
+    </w:p>
+    <w:p>
+      <w:pPr>
+        <w:ind w:left="720"/>
+        <w:rPr>
+          <w:rFonts w:asciiTheme="majorHAnsi" w:hAnsiTheme="majorHAnsi" w:cstheme="majorHAnsi"/>
+          <w:sz w:val="26"/>
+          <w:szCs w:val="26"/>
+          <w:lang w:val="en-US"/>
+        </w:rPr>
+      </w:pPr>
+      <w:r>
+        <w:rPr>
+          <w:rFonts w:asciiTheme="majorHAnsi" w:hAnsiTheme="majorHAnsi" w:cstheme="majorHAnsi"/>
+          <w:sz w:val="26"/>
+          <w:szCs w:val="26"/>
+        </w:rPr>
+        <w:t>Kiểm tra Docker đã cài chưa</w:t>
+      </w:r>
+    </w:p>
+    <w:p>
+      <w:pPr>
+        <w:pStyle w:val="ListParagraph"/>
+        <w:ind w:left="1440"/>
+        <w:rPr>
+          <w:rFonts w:asciiTheme="majorHAnsi" w:hAnsiTheme="majorHAnsi" w:cstheme="majorHAnsi"/>
+          <w:sz w:val="26"/>
+          <w:szCs w:val="26"/>
+          <w:lang w:val="en-US"/>
+        </w:rPr>
+      </w:pPr>
+      <w:r>
+        <w:rPr>
+          <w:rFonts w:asciiTheme="majorHAnsi" w:hAnsiTheme="majorHAnsi" w:cstheme="majorHAnsi"/>
+          <w:sz w:val="26"/>
+          <w:szCs w:val="26"/>
+          <w:lang w:val="en-US"/>
+        </w:rPr>
+        <w:drawing>
+          <wp:inline distT="0" distB="0" distL="0" distR="0" wp14:anchorId="483A0741" wp14:editId="792B0A44">
+            <wp:extent cx="4314190" cy="1198385"/>
+            <wp:effectExtent l="0" t="0" r="0" b="1905"/>
+            <wp:docPr id="1248157707" name="Picture 1"/>
+            <wp:cNvGraphicFramePr>
+              <a:graphicFrameLocks xmlns:a="http://schemas.openxmlformats.org/drawingml/2006/main" noChangeAspect="1"/>
+            </wp:cNvGraphicFramePr>
+            <a:graphic xmlns:a="http://schemas.openxmlformats.org/drawingml/2006/main">
+              <a:graphicData uri="http://schemas.openxmlformats.org/drawingml/2006/picture">
+                <pic:pic xmlns:pic="http://schemas.openxmlformats.org/drawingml/2006/picture">
+                  <pic:nvPicPr>
+                    <pic:cNvPr id="1248157707" name=""/>
+                    <pic:cNvPicPr/>
+                  </pic:nvPicPr>
+                  <pic:blipFill>
+                    <a:blip r:embed="rId9"/>
+                    <a:stretch>
+                      <a:fillRect/>
+                    </a:stretch>
+                  </pic:blipFill>
+                  <pic:spPr>
+                    <a:xfrm>
+                      <a:off x="0" y="0"/>
+                      <a:ext cx="4314190" cy="1198385"/>
+                    </a:xfrm>
+                    <a:prstGeom prst="rect">
+                      <a:avLst/>
+                    </a:prstGeom>
+                  </pic:spPr>
+                </pic:pic>
+              </a:graphicData>
+            </a:graphic>
+          </wp:inline>
+        </w:drawing>
+      </w:r>
+    </w:p>
+    <w:p>
+      <w:pPr>
+        <w:pStyle w:val="ListParagraph"/>
+        <w:numPr>
+          <w:ilvl w:val="0"/>
+          <w:numId w:val="26"/>
+        </w:numPr>
+        <w:rPr>
+          <w:noProof/>
+          <w:lang w:val="en-US"/>
+        </w:rPr>
+      </w:pPr>
+      <w:r>
+        <w:rPr>
+          <w:rFonts w:asciiTheme="majorHAnsi" w:hAnsiTheme="majorHAnsi" w:cstheme="majorHAnsi"/>
+          <w:sz w:val="26"/>
+          <w:szCs w:val="26"/>
+          <w:lang w:val="en-US"/>
+        </w:rPr>
+        <w:lastRenderedPageBreak/>
+        <w:t>docker run hello-world</w:t>
+      </w:r>
+      <w:r>
+        <w:rPr>
+          <w:noProof/>
+        </w:rPr>
+        <w:t xml:space="preserve"> </w:t>
+      </w:r>
+    </w:p>
+    <w:p>
+      <w:pPr>
+        <w:ind w:left="720"/>
+        <w:rPr>
+          <w:rFonts w:asciiTheme="majorHAnsi" w:hAnsiTheme="majorHAnsi" w:cstheme="majorHAnsi"/>
+          <w:sz w:val="26"/>
+          <w:szCs w:val="26"/>
+          <w:lang w:val="en-US"/>
+        </w:rPr>
+      </w:pPr>
+      <w:r>
+        <w:rPr>
+          <w:rFonts w:asciiTheme="majorHAnsi" w:hAnsiTheme="majorHAnsi" w:cstheme="majorHAnsi"/>
+          <w:sz w:val="26"/>
+          <w:szCs w:val="26"/>
+        </w:rPr>
+        <w:t>Test Docker hoạt động</w:t>
+      </w:r>
+      <w:r>
+        <w:rPr>
+          <w:rFonts w:asciiTheme="majorHAnsi" w:hAnsiTheme="majorHAnsi" w:cstheme="majorHAnsi"/>
+          <w:sz w:val="26"/>
+          <w:szCs w:val="26"/>
+          <w:lang w:val="en-US"/>
+        </w:rPr>
+        <w:t xml:space="preserve"> </w:t>
+      </w:r>
+      <w:r>
+        <w:rPr>
+          <w:lang w:val="en-US"/>
+        </w:rPr>
+        <w:drawing>
+          <wp:inline distT="0" distB="0" distL="0" distR="0" wp14:anchorId="05AE0435" wp14:editId="30EBBD35">
+            <wp:extent cx="6172200" cy="3426321"/>
+            <wp:effectExtent l="0" t="0" r="0" b="3175"/>
+            <wp:docPr id="1267561560" name="Picture 1"/>
+            <wp:cNvGraphicFramePr>
+              <a:graphicFrameLocks xmlns:a="http://schemas.openxmlformats.org/drawingml/2006/main" noChangeAspect="1"/>
+            </wp:cNvGraphicFramePr>
+            <a:graphic xmlns:a="http://schemas.openxmlformats.org/drawingml/2006/main">
+              <a:graphicData uri="http://schemas.openxmlformats.org/drawingml/2006/picture">
+                <pic:pic xmlns:pic="http://schemas.openxmlformats.org/drawingml/2006/picture">
+                  <pic:nvPicPr>
+                    <pic:cNvPr id="1267561560" name=""/>
+                    <pic:cNvPicPr/>
+                  </pic:nvPicPr>
+                  <pic:blipFill>
+                    <a:blip r:embed="rId10"/>
+                    <a:stretch>
+                      <a:fillRect/>
+                    </a:stretch>
+                  </pic:blipFill>
+                  <pic:spPr>
+                    <a:xfrm>
+                      <a:off x="0" y="0"/>
+                      <a:ext cx="6176672" cy="3428803"/>
+                    </a:xfrm>
+                    <a:prstGeom prst="rect">
+                      <a:avLst/>
+                    </a:prstGeom>
+                  </pic:spPr>
+                </pic:pic>
+              </a:graphicData>
+            </a:graphic>
+          </wp:inline>
+        </w:drawing>
+      </w:r>
+    </w:p>
+    <w:p>
+      <w:pPr>
+        <w:pStyle w:val="ListParagraph"/>
+        <w:numPr>
+          <w:ilvl w:val="0"/>
+          <w:numId w:val="26"/>
+        </w:numPr>
+        <w:rPr>
+          <w:rFonts w:asciiTheme="majorHAnsi" w:hAnsiTheme="majorHAnsi" w:cstheme="majorHAnsi"/>
+          <w:sz w:val="26"/>
+          <w:szCs w:val="26"/>
+          <w:lang w:val="en-US"/>
+        </w:rPr>
+      </w:pPr>
+      <w:r>
+        <w:rPr>
+          <w:rFonts w:asciiTheme="majorHAnsi" w:hAnsiTheme="majorHAnsi" w:cstheme="majorHAnsi"/>
+          <w:sz w:val="26"/>
+          <w:szCs w:val="26"/>
+          <w:lang w:val="en-US"/>
+        </w:rPr>
+        <w:t>docker pull nginx</w:t>
+      </w:r>
+    </w:p>
+    <w:p>
+      <w:pPr>
+        <w:ind w:left="720"/>
+        <w:rPr>
+          <w:rFonts w:asciiTheme="majorHAnsi" w:hAnsiTheme="majorHAnsi" w:cstheme="majorHAnsi"/>
+          <w:sz w:val="26"/>
+          <w:szCs w:val="26"/>
+          <w:lang w:val="en-US"/>
+        </w:rPr>
+      </w:pPr>
+      <w:r>
+        <w:rPr>
+          <w:noProof/>
+        </w:rPr>
+        <w:t>Tải image nginx từ Docker Hub</w:t>
+      </w:r>
+      <w:r>
+        <w:rPr>
+          <w:noProof/>
+        </w:rPr>
+        <w:t xml:space="preserve"> </w:t>
+      </w:r>
+      <w:r>
+        <w:rPr>
+          <w:lang w:val="en-US"/>
+        </w:rPr>
+        <w:drawing>
+          <wp:inline distT="0" distB="0" distL="0" distR="0" wp14:anchorId="52029236" wp14:editId="00D1E29C">
+            <wp:extent cx="7315200" cy="3825240"/>
+            <wp:effectExtent l="0" t="0" r="0" b="3810"/>
+            <wp:docPr id="1903464313" name="Picture 1"/>
+            <wp:cNvGraphicFramePr>
+              <a:graphicFrameLocks xmlns:a="http://schemas.openxmlformats.org/drawingml/2006/main" noChangeAspect="1"/>
+            </wp:cNvGraphicFramePr>
+            <a:graphic xmlns:a="http://schemas.openxmlformats.org/drawingml/2006/main">
+              <a:graphicData uri="http://schemas.openxmlformats.org/drawingml/2006/picture">
+                <pic:pic xmlns:pic="http://schemas.openxmlformats.org/drawingml/2006/picture">
+                  <pic:nvPicPr>
+                    <pic:cNvPr id="1903464313" name=""/>
+                    <pic:cNvPicPr/>
+                  </pic:nvPicPr>
+                  <pic:blipFill>
+                    <a:blip r:embed="rId11"/>
+                    <a:stretch>
+                      <a:fillRect/>
+                    </a:stretch>
+                  </pic:blipFill>
+                  <pic:spPr>
+                    <a:xfrm>
+                      <a:off x="0" y="0"/>
+                      <a:ext cx="7332065" cy="3834059"/>
+                    </a:xfrm>
+                    <a:prstGeom prst="rect">
+                      <a:avLst/>
+                    </a:prstGeom>
+                  </pic:spPr>
+                </pic:pic>
+              </a:graphicData>
+            </a:graphic>
+          </wp:inline>
+        </w:drawing>
+      </w:r>
+      <w:r>
+        <w:rPr>
+          <w:rFonts w:asciiTheme="majorHAnsi" w:hAnsiTheme="majorHAnsi" w:cstheme="majorHAnsi"/>
+          <w:sz w:val="26"/>
+          <w:szCs w:val="26"/>
+          <w:lang w:val="en-US"/>
+        </w:rPr>
+        <w:tab/>
+      </w:r>
+    </w:p>
+    <w:p>
+      <w:pPr>
+        <w:pStyle w:val="ListParagraph"/>
+        <w:numPr>
+          <w:ilvl w:val="0"/>
+          <w:numId w:val="26"/>
+        </w:numPr>
+        <w:rPr>
+          <w:noProof/>
+          <w:lang w:val="en-US"/>
+        </w:rPr>
+      </w:pPr>
+      <w:r>
+        <w:rPr>
+          <w:rFonts w:asciiTheme="majorHAnsi" w:hAnsiTheme="majorHAnsi" w:cstheme="majorHAnsi"/>
+          <w:sz w:val="26"/>
+          <w:szCs w:val="26"/>
+          <w:lang w:val="en-US"/>
+        </w:rPr>
+        <w:lastRenderedPageBreak/>
+        <w:t>docker images</w:t>
+      </w:r>
+      <w:r>
+        <w:rPr>
+          <w:noProof/>
+        </w:rPr>
+        <w:t xml:space="preserve"> </w:t>
+      </w:r>
+    </w:p>
+    <w:p>
+      <w:pPr>
+        <w:ind w:left="720"/>
+        <w:rPr>
+          <w:rFonts w:asciiTheme="majorHAnsi" w:hAnsiTheme="majorHAnsi" w:cstheme="majorHAnsi"/>
+          <w:sz w:val="26"/>
+          <w:szCs w:val="26"/>
+          <w:lang w:val="en-US"/>
+        </w:rPr>
+      </w:pPr>
+      <w:r>
+        <w:rPr>
+          <w:rFonts w:asciiTheme="majorHAnsi" w:hAnsiTheme="majorHAnsi" w:cstheme="majorHAnsi"/>
+          <w:sz w:val="26"/>
+          <w:szCs w:val="26"/>
+          <w:lang w:val="en-US"/>
+        </w:rPr>
+        <w:t>Xem danh sách image</w:t>
+      </w:r>
+      <w:r>
+        <w:rPr>
+          <w:rFonts w:asciiTheme="majorHAnsi" w:hAnsiTheme="majorHAnsi" w:cstheme="majorHAnsi"/>
+          <w:sz w:val="26"/>
+          <w:szCs w:val="26"/>
+          <w:lang w:val="en-US"/>
+        </w:rPr>
+        <w:t xml:space="preserve"> </w:t>
+      </w:r>
+      <w:r>
+        <w:rPr>
+          <w:lang w:val="en-US"/>
+        </w:rPr>
+        <w:drawing>
+          <wp:inline distT="0" distB="0" distL="0" distR="0" wp14:anchorId="46FFAD13" wp14:editId="2A688F1F">
+            <wp:extent cx="6559299" cy="1780463"/>
+            <wp:effectExtent l="0" t="0" r="0" b="0"/>
+            <wp:docPr id="1747369058" name="Picture 1"/>
+            <wp:cNvGraphicFramePr>
+              <a:graphicFrameLocks xmlns:a="http://schemas.openxmlformats.org/drawingml/2006/main" noChangeAspect="1"/>
+            </wp:cNvGraphicFramePr>
+            <a:graphic xmlns:a="http://schemas.openxmlformats.org/drawingml/2006/main">
+              <a:graphicData uri="http://schemas.openxmlformats.org/drawingml/2006/picture">
+                <pic:pic xmlns:pic="http://schemas.openxmlformats.org/drawingml/2006/picture">
+                  <pic:nvPicPr>
+                    <pic:cNvPr id="1747369058" name=""/>
+                    <pic:cNvPicPr/>
+                  </pic:nvPicPr>
+                  <pic:blipFill>
+                    <a:blip r:embed="rId12"/>
+                    <a:stretch>
+                      <a:fillRect/>
+                    </a:stretch>
+                  </pic:blipFill>
+                  <pic:spPr>
+                    <a:xfrm>
+                      <a:off x="0" y="0"/>
+                      <a:ext cx="6585538" cy="1787585"/>
+                    </a:xfrm>
+                    <a:prstGeom prst="rect">
+                      <a:avLst/>
+                    </a:prstGeom>
+                  </pic:spPr>
+                </pic:pic>
+              </a:graphicData>
+            </a:graphic>
+          </wp:inline>
+        </w:drawing>
+      </w:r>
+    </w:p>
+    <w:p>
+      <w:pPr>
+        <w:pStyle w:val="ListParagraph"/>
+        <w:numPr>
+          <w:ilvl w:val="0"/>
+          <w:numId w:val="26"/>
+        </w:numPr>
+        <w:rPr>
+          <w:noProof/>
+          <w:lang w:val="en-US"/>
+        </w:rPr>
+      </w:pPr>
+      <w:r>
+        <w:rPr>
+          <w:rFonts w:asciiTheme="majorHAnsi" w:hAnsiTheme="majorHAnsi" w:cstheme="majorHAnsi"/>
+          <w:sz w:val="26"/>
+          <w:szCs w:val="26"/>
+          <w:lang w:val="en-US"/>
+        </w:rPr>
+        <w:t>docker run -d nginx</w:t>
+      </w:r>
+      <w:r>
+        <w:rPr>
+          <w:noProof/>
+        </w:rPr>
+        <w:t xml:space="preserve"> </w:t>
+      </w:r>
+    </w:p>
+    <w:p>
+      <w:pPr>
+        <w:ind w:left="720"/>
+        <w:rPr>
+          <w:rFonts w:asciiTheme="majorHAnsi" w:hAnsiTheme="majorHAnsi" w:cstheme="majorHAnsi"/>
+          <w:sz w:val="26"/>
+          <w:szCs w:val="26"/>
+          <w:lang w:val="en-US"/>
+        </w:rPr>
+      </w:pPr>
+      <w:r>
+        <w:rPr>
+          <w:rFonts w:asciiTheme="majorHAnsi" w:hAnsiTheme="majorHAnsi" w:cstheme="majorHAnsi"/>
+          <w:sz w:val="26"/>
+          <w:szCs w:val="26"/>
+        </w:rPr>
+        <w:t>Chạy container nginx (chạy nền</w:t>
+      </w:r>
+      <w:r>
+        <w:rPr>
+          <w:rFonts w:asciiTheme="majorHAnsi" w:hAnsiTheme="majorHAnsi" w:cstheme="majorHAnsi"/>
+          <w:sz w:val="26"/>
+          <w:szCs w:val="26"/>
+          <w:lang w:val="en-US"/>
+        </w:rPr>
+        <w:t>)</w:t>
+      </w:r>
+      <w:r>
+        <w:rPr>
+          <w:lang w:val="en-US"/>
+        </w:rPr>
+        <w:drawing>
+          <wp:inline distT="0" distB="0" distL="0" distR="0" wp14:anchorId="79B3B79A" wp14:editId="5A43FF1E">
+            <wp:extent cx="6347458" cy="707288"/>
+            <wp:effectExtent l="0" t="0" r="0" b="0"/>
+            <wp:docPr id="44744310" name="Picture 1"/>
+            <wp:cNvGraphicFramePr>
+              <a:graphicFrameLocks xmlns:a="http://schemas.openxmlformats.org/drawingml/2006/main" noChangeAspect="1"/>
+            </wp:cNvGraphicFramePr>
+            <a:graphic xmlns:a="http://schemas.openxmlformats.org/drawingml/2006/main">
+              <a:graphicData uri="http://schemas.openxmlformats.org/drawingml/2006/picture">
+                <pic:pic xmlns:pic="http://schemas.openxmlformats.org/drawingml/2006/picture">
+                  <pic:nvPicPr>
+                    <pic:cNvPr id="44744310" name=""/>
+                    <pic:cNvPicPr/>
+                  </pic:nvPicPr>
+                  <pic:blipFill>
+                    <a:blip r:embed="rId13"/>
+                    <a:stretch>
+                      <a:fillRect/>
+                    </a:stretch>
+                  </pic:blipFill>
+                  <pic:spPr>
+                    <a:xfrm>
+                      <a:off x="0" y="0"/>
+                      <a:ext cx="6361226" cy="708822"/>
+                    </a:xfrm>
+                    <a:prstGeom prst="rect">
+                      <a:avLst/>
+                    </a:prstGeom>
+                  </pic:spPr>
+                </pic:pic>
+              </a:graphicData>
+            </a:graphic>
+          </wp:inline>
+        </w:drawing>
+      </w:r>
+      <w:r>
+        <w:rPr>
+          <w:rFonts w:asciiTheme="majorHAnsi" w:hAnsiTheme="majorHAnsi" w:cstheme="majorHAnsi"/>
+          <w:sz w:val="26"/>
+          <w:szCs w:val="26"/>
+          <w:lang w:val="en-US"/>
+        </w:rPr>
+        <w:tab/>
+      </w:r>
+    </w:p>
+    <w:p>
+      <w:pPr>
+        <w:pStyle w:val="ListParagraph"/>
+        <w:numPr>
+          <w:ilvl w:val="0"/>
+          <w:numId w:val="26"/>
+        </w:numPr>
+        <w:rPr>
+          <w:noProof/>
+          <w:lang w:val="en-US"/>
+        </w:rPr>
+      </w:pPr>
+      <w:r>
+        <w:rPr>
+          <w:rFonts w:asciiTheme="majorHAnsi" w:hAnsiTheme="majorHAnsi" w:cstheme="majorHAnsi"/>
+          <w:sz w:val="26"/>
+          <w:szCs w:val="26"/>
+          <w:lang w:val="en-US"/>
+        </w:rPr>
+        <w:t>docker ps</w:t>
+      </w:r>
+      <w:r>
+        <w:rPr>
+          <w:noProof/>
+        </w:rPr>
+        <w:t xml:space="preserve"> </w:t>
+      </w:r>
+    </w:p>
+    <w:p>
+      <w:pPr>
+        <w:ind w:left="720"/>
+        <w:rPr>
+          <w:rFonts w:asciiTheme="majorHAnsi" w:hAnsiTheme="majorHAnsi" w:cstheme="majorHAnsi"/>
+          <w:sz w:val="26"/>
+          <w:szCs w:val="26"/>
+          <w:lang w:val="en-US"/>
+        </w:rPr>
+      </w:pPr>
+      <w:r>
+        <w:rPr>
+          <w:rFonts w:asciiTheme="majorHAnsi" w:hAnsiTheme="majorHAnsi" w:cstheme="majorHAnsi"/>
+          <w:sz w:val="26"/>
+          <w:szCs w:val="26"/>
+        </w:rPr>
+        <w:t>Xem container đang chạ</w:t>
+      </w:r>
+      <w:r>
+        <w:rPr>
+          <w:rFonts w:asciiTheme="majorHAnsi" w:hAnsiTheme="majorHAnsi" w:cstheme="majorHAnsi"/>
+          <w:sz w:val="26"/>
+          <w:szCs w:val="26"/>
+          <w:lang w:val="en-US"/>
+        </w:rPr>
+        <w:t>y</w:t>
+      </w:r>
+      <w:r>
+        <w:rPr>
+          <w:lang w:val="en-US"/>
+        </w:rPr>
+        <w:drawing>
+          <wp:inline distT="0" distB="0" distL="0" distR="0" wp14:anchorId="17E6434E" wp14:editId="02656DE2">
+            <wp:extent cx="6576060" cy="642193"/>
+            <wp:effectExtent l="0" t="0" r="0" b="5715"/>
+            <wp:docPr id="1328002206" name="Picture 1"/>
+            <wp:cNvGraphicFramePr>
+              <a:graphicFrameLocks xmlns:a="http://schemas.openxmlformats.org/drawingml/2006/main" noChangeAspect="1"/>
+            </wp:cNvGraphicFramePr>
+            <a:graphic xmlns:a="http://schemas.openxmlformats.org/drawingml/2006/main">
+              <a:graphicData uri="http://schemas.openxmlformats.org/drawingml/2006/picture">
+                <pic:pic xmlns:pic="http://schemas.openxmlformats.org/drawingml/2006/picture">
+                  <pic:nvPicPr>
+                    <pic:cNvPr id="1328002206" name=""/>
+                    <pic:cNvPicPr/>
+                  </pic:nvPicPr>
+                  <pic:blipFill>
+                    <a:blip r:embed="rId14"/>
+                    <a:stretch>
+                      <a:fillRect/>
+                    </a:stretch>
+                  </pic:blipFill>
+                  <pic:spPr>
+                    <a:xfrm>
+                      <a:off x="0" y="0"/>
+                      <a:ext cx="6618877" cy="646374"/>
+                    </a:xfrm>
+                    <a:prstGeom prst="rect">
+                      <a:avLst/>
+                    </a:prstGeom>
+                  </pic:spPr>
+                </pic:pic>
+              </a:graphicData>
+            </a:graphic>
+          </wp:inline>
+        </w:drawing>
+      </w:r>
+    </w:p>
+    <w:p>
+      <w:pPr>
+        <w:pStyle w:val="ListParagraph"/>
+        <w:numPr>
+          <w:ilvl w:val="0"/>
+          <w:numId w:val="26"/>
+        </w:numPr>
+        <w:rPr>
+          <w:rFonts w:asciiTheme="majorHAnsi" w:hAnsiTheme="majorHAnsi" w:cstheme="majorHAnsi"/>
+          <w:sz w:val="26"/>
+          <w:szCs w:val="26"/>
+          <w:lang w:val="en-US"/>
+        </w:rPr>
+      </w:pPr>
+      <w:r>
+        <w:rPr>
+          <w:rFonts w:asciiTheme="majorHAnsi" w:hAnsiTheme="majorHAnsi" w:cstheme="majorHAnsi"/>
+          <w:sz w:val="26"/>
+          <w:szCs w:val="26"/>
+          <w:lang w:val="en-US"/>
+        </w:rPr>
+        <w:t>docker ps -a</w:t>
+      </w:r>
+    </w:p>
+    <w:p>
+      <w:pPr>
+        <w:ind w:left="720"/>
+        <w:rPr>
+          <w:rFonts w:asciiTheme="majorHAnsi" w:hAnsiTheme="majorHAnsi" w:cstheme="majorHAnsi"/>
+          <w:sz w:val="26"/>
+          <w:szCs w:val="26"/>
+          <w:lang w:val="en-US"/>
+        </w:rPr>
+      </w:pPr>
+      <w:r>
+        <w:rPr>
+          <w:rFonts w:asciiTheme="majorHAnsi" w:hAnsiTheme="majorHAnsi" w:cstheme="majorHAnsi"/>
+          <w:sz w:val="26"/>
+          <w:szCs w:val="26"/>
+        </w:rPr>
+        <w:t>Xem tất cả container (kể cả đã stop)</w:t>
+      </w:r>
+      <w:r>
+        <w:rPr>
+          <w:rFonts w:asciiTheme="majorHAnsi" w:hAnsiTheme="majorHAnsi" w:cstheme="majorHAnsi"/>
+          <w:sz w:val="26"/>
+          <w:szCs w:val="26"/>
+          <w:lang w:val="en-US"/>
+        </w:rPr>
+        <w:t xml:space="preserve"> </w:t>
+      </w:r>
+      <w:r>
+        <w:rPr>
+          <w:lang w:val="en-US"/>
+        </w:rPr>
+        <w:drawing>
+          <wp:inline distT="0" distB="0" distL="0" distR="0" wp14:anchorId="0ACAFFFA" wp14:editId="5170DD3C">
+            <wp:extent cx="6614160" cy="1902145"/>
+            <wp:effectExtent l="0" t="0" r="0" b="3175"/>
+            <wp:docPr id="2005395574" name="Picture 1"/>
+            <wp:cNvGraphicFramePr>
+              <a:graphicFrameLocks xmlns:a="http://schemas.openxmlformats.org/drawingml/2006/main" noChangeAspect="1"/>
+            </wp:cNvGraphicFramePr>
+            <a:graphic xmlns:a="http://schemas.openxmlformats.org/drawingml/2006/main">
+              <a:graphicData uri="http://schemas.openxmlformats.org/drawingml/2006/picture">
+                <pic:pic xmlns:pic="http://schemas.openxmlformats.org/drawingml/2006/picture">
+                  <pic:nvPicPr>
+                    <pic:cNvPr id="2005395574" name=""/>
+                    <pic:cNvPicPr/>
+                  </pic:nvPicPr>
+                  <pic:blipFill>
+                    <a:blip r:embed="rId15"/>
+                    <a:stretch>
+                      <a:fillRect/>
+                    </a:stretch>
+                  </pic:blipFill>
+                  <pic:spPr>
+                    <a:xfrm>
+                      <a:off x="0" y="0"/>
+                      <a:ext cx="6615273" cy="1902465"/>
+                    </a:xfrm>
+                    <a:prstGeom prst="rect">
+                      <a:avLst/>
+                    </a:prstGeom>
+                  </pic:spPr>
+                </pic:pic>
+              </a:graphicData>
+            </a:graphic>
+          </wp:inline>
+        </w:drawing>
+      </w:r>
+    </w:p>
+    <w:p>
+      <w:pPr>
+        <w:pStyle w:val="ListParagraph"/>
+        <w:numPr>
+          <w:ilvl w:val="0"/>
+          <w:numId w:val="26"/>
+        </w:numPr>
+        <w:rPr>
+          <w:rFonts w:asciiTheme="majorHAnsi" w:hAnsiTheme="majorHAnsi" w:cstheme="majorHAnsi"/>
+          <w:sz w:val="26"/>
+          <w:szCs w:val="26"/>
+          <w:lang w:val="en-US"/>
+        </w:rPr>
+      </w:pPr>
+      <w:r>
+        <w:rPr>
+          <w:rFonts w:asciiTheme="majorHAnsi" w:hAnsiTheme="majorHAnsi" w:cstheme="majorHAnsi"/>
+          <w:sz w:val="26"/>
+          <w:szCs w:val="26"/>
+          <w:lang w:val="en-US"/>
+        </w:rPr>
+        <w:t>docker logs &lt;container_id&gt;</w:t>
+      </w:r>
+    </w:p>
+    <w:p>
+      <w:pPr>
+        <w:ind w:left="720"/>
+        <w:rPr>
+          <w:rFonts w:asciiTheme="majorHAnsi" w:hAnsiTheme="majorHAnsi" w:cstheme="majorHAnsi"/>
+          <w:sz w:val="26"/>
+          <w:szCs w:val="26"/>
+          <w:lang w:val="en-US"/>
+        </w:rPr>
+      </w:pPr>
+      <w:r>
+        <w:rPr>
+          <w:rFonts w:asciiTheme="majorHAnsi" w:hAnsiTheme="majorHAnsi" w:cstheme="majorHAnsi"/>
+          <w:sz w:val="26"/>
+          <w:szCs w:val="26"/>
+        </w:rPr>
+        <w:t>Xem log</w:t>
+      </w:r>
+      <w:r>
+        <w:rPr>
+          <w:rFonts w:asciiTheme="majorHAnsi" w:hAnsiTheme="majorHAnsi" w:cstheme="majorHAnsi"/>
+          <w:sz w:val="26"/>
+          <w:szCs w:val="26"/>
+          <w:lang w:val="en-US"/>
+        </w:rPr>
+        <w:t xml:space="preserve"> của container</w:t>
+      </w:r>
+      <w:r>
+        <w:rPr>
+          <w:rFonts w:asciiTheme="majorHAnsi" w:hAnsiTheme="majorHAnsi" w:cstheme="majorHAnsi"/>
+          <w:sz w:val="26"/>
+          <w:szCs w:val="26"/>
+          <w:lang w:val="en-US"/>
+        </w:rPr>
+        <w:t>_</w:t>
+      </w:r>
+      <w:r>
+        <w:rPr>
+          <w:rFonts w:asciiTheme="majorHAnsi" w:hAnsiTheme="majorHAnsi" w:cstheme="majorHAnsi"/>
+          <w:sz w:val="26"/>
+          <w:szCs w:val="26"/>
+          <w:lang w:val="en-US"/>
+        </w:rPr>
+        <w:t>id</w:t>
+      </w:r>
+    </w:p>
+    <w:p>
+      <w:pPr>
+        <w:ind w:left="720"/>
+        <w:rPr>
+          <w:rFonts w:asciiTheme="majorHAnsi" w:hAnsiTheme="majorHAnsi" w:cstheme="majorHAnsi"/>
+          <w:sz w:val="26"/>
+          <w:szCs w:val="26"/>
+          <w:lang w:val="en-US"/>
+        </w:rPr>
+      </w:pPr>
+      <w:r>
+        <w:rPr>
+          <w:lang w:val="en-US"/>
+        </w:rPr>
+        <w:lastRenderedPageBreak/>
+        <w:drawing>
+          <wp:inline distT="0" distB="0" distL="0" distR="0" wp14:anchorId="45E6979F" wp14:editId="623292B9">
+            <wp:extent cx="5836920" cy="2814085"/>
+            <wp:effectExtent l="0" t="0" r="0" b="5715"/>
+            <wp:docPr id="186938835" name="Picture 1"/>
+            <wp:cNvGraphicFramePr>
+              <a:graphicFrameLocks xmlns:a="http://schemas.openxmlformats.org/drawingml/2006/main" noChangeAspect="1"/>
+            </wp:cNvGraphicFramePr>
+            <a:graphic xmlns:a="http://schemas.openxmlformats.org/drawingml/2006/main">
+              <a:graphicData uri="http://schemas.openxmlformats.org/drawingml/2006/picture">
+                <pic:pic xmlns:pic="http://schemas.openxmlformats.org/drawingml/2006/picture">
+                  <pic:nvPicPr>
+                    <pic:cNvPr id="186938835" name=""/>
+                    <pic:cNvPicPr/>
+                  </pic:nvPicPr>
+                  <pic:blipFill>
+                    <a:blip r:embed="rId16"/>
+                    <a:stretch>
+                      <a:fillRect/>
+                    </a:stretch>
+                  </pic:blipFill>
+                  <pic:spPr>
+                    <a:xfrm>
+                      <a:off x="0" y="0"/>
+                      <a:ext cx="5842812" cy="2816925"/>
+                    </a:xfrm>
+                    <a:prstGeom prst="rect">
+                      <a:avLst/>
+                    </a:prstGeom>
+                  </pic:spPr>
+                </pic:pic>
+              </a:graphicData>
+            </a:graphic>
+          </wp:inline>
+        </w:drawing>
+      </w:r>
+    </w:p>
+    <w:p>
+      <w:pPr>
+        <w:pStyle w:val="ListParagraph"/>
+        <w:numPr>
+          <w:ilvl w:val="0"/>
+          <w:numId w:val="26"/>
+        </w:numPr>
+        <w:rPr>
+          <w:rFonts w:asciiTheme="majorHAnsi" w:hAnsiTheme="majorHAnsi" w:cstheme="majorHAnsi"/>
+          <w:sz w:val="26"/>
+          <w:szCs w:val="26"/>
+          <w:lang w:val="en-US"/>
+        </w:rPr>
+      </w:pPr>
+      <w:r>
+        <w:rPr>
+          <w:rFonts w:asciiTheme="majorHAnsi" w:hAnsiTheme="majorHAnsi" w:cstheme="majorHAnsi"/>
+          <w:sz w:val="26"/>
+          <w:szCs w:val="26"/>
+          <w:lang w:val="en-US"/>
+        </w:rPr>
+        <w:t>docker exec -it &lt;container_id&gt; /bin/sh</w:t>
+      </w:r>
+      <w:r>
+        <w:rPr>
+          <w:rFonts w:asciiTheme="majorHAnsi" w:hAnsiTheme="majorHAnsi" w:cstheme="majorHAnsi"/>
+          <w:sz w:val="26"/>
+          <w:szCs w:val="26"/>
+          <w:lang w:val="en-US"/>
+        </w:rPr>
+        <w:tab/>
+      </w:r>
+    </w:p>
+    <w:p>
+      <w:pPr>
+        <w:ind w:left="720"/>
+        <w:rPr>
+          <w:rFonts w:asciiTheme="majorHAnsi" w:hAnsiTheme="majorHAnsi" w:cstheme="majorHAnsi"/>
+          <w:sz w:val="26"/>
+          <w:szCs w:val="26"/>
+          <w:lang w:val="en-US"/>
+        </w:rPr>
+      </w:pPr>
+      <w:r>
+        <w:rPr>
+          <w:rFonts w:asciiTheme="majorHAnsi" w:hAnsiTheme="majorHAnsi" w:cstheme="majorHAnsi"/>
+          <w:sz w:val="26"/>
+          <w:szCs w:val="26"/>
+        </w:rPr>
+        <w:t>Vào bên trong container</w:t>
+      </w:r>
+    </w:p>
+    <w:p>
+      <w:pPr>
+        <w:ind w:left="720"/>
+        <w:rPr>
+          <w:rFonts w:asciiTheme="majorHAnsi" w:hAnsiTheme="majorHAnsi" w:cstheme="majorHAnsi"/>
+          <w:sz w:val="26"/>
+          <w:szCs w:val="26"/>
+          <w:lang w:val="en-US"/>
+        </w:rPr>
+      </w:pPr>
+      <w:r>
+        <w:rPr>
+          <w:rFonts w:asciiTheme="majorHAnsi" w:hAnsiTheme="majorHAnsi" w:cstheme="majorHAnsi"/>
+          <w:sz w:val="26"/>
+          <w:szCs w:val="26"/>
+          <w:lang w:val="en-US"/>
+        </w:rPr>
+        <w:drawing>
+          <wp:inline distT="0" distB="0" distL="0" distR="0" wp14:anchorId="6B37F84D" wp14:editId="43F7AB0E">
+            <wp:extent cx="7315200" cy="677545"/>
+            <wp:effectExtent l="0" t="0" r="0" b="8255"/>
+            <wp:docPr id="904583716" name="Picture 1"/>
+            <wp:cNvGraphicFramePr>
+              <a:graphicFrameLocks xmlns:a="http://schemas.openxmlformats.org/drawingml/2006/main" noChangeAspect="1"/>
+            </wp:cNvGraphicFramePr>
+            <a:graphic xmlns:a="http://schemas.openxmlformats.org/drawingml/2006/main">
+              <a:graphicData uri="http://schemas.openxmlformats.org/drawingml/2006/picture">
+                <pic:pic xmlns:pic="http://schemas.openxmlformats.org/drawingml/2006/picture">
+                  <pic:nvPicPr>
+                    <pic:cNvPr id="904583716" name=""/>
+                    <pic:cNvPicPr/>
+                  </pic:nvPicPr>
+                  <pic:blipFill>
+                    <a:blip r:embed="rId17"/>
+                    <a:stretch>
+                      <a:fillRect/>
+                    </a:stretch>
+                  </pic:blipFill>
+                  <pic:spPr>
+                    <a:xfrm>
+                      <a:off x="0" y="0"/>
+                      <a:ext cx="7315200" cy="677545"/>
+                    </a:xfrm>
+                    <a:prstGeom prst="rect">
+                      <a:avLst/>
+                    </a:prstGeom>
+                  </pic:spPr>
+                </pic:pic>
+              </a:graphicData>
+            </a:graphic>
+          </wp:inline>
+        </w:drawing>
+      </w:r>
+    </w:p>
+    <w:p>
+      <w:pPr>
+        <w:pStyle w:val="ListParagraph"/>
+        <w:numPr>
+          <w:ilvl w:val="0"/>
+          <w:numId w:val="26"/>
+        </w:numPr>
+        <w:rPr>
+          <w:rFonts w:asciiTheme="majorHAnsi" w:hAnsiTheme="majorHAnsi" w:cstheme="majorHAnsi"/>
+          <w:sz w:val="26"/>
+          <w:szCs w:val="26"/>
+          <w:lang w:val="en-US"/>
+        </w:rPr>
+      </w:pPr>
+      <w:r>
+        <w:rPr>
+          <w:rFonts w:asciiTheme="majorHAnsi" w:hAnsiTheme="majorHAnsi" w:cstheme="majorHAnsi"/>
+          <w:sz w:val="26"/>
+          <w:szCs w:val="26"/>
+          <w:lang w:val="en-US"/>
+        </w:rPr>
+        <w:t>docker stop &lt;container_id&gt;</w:t>
+      </w:r>
+      <w:r>
+        <w:rPr>
+          <w:rFonts w:asciiTheme="majorHAnsi" w:hAnsiTheme="majorHAnsi" w:cstheme="majorHAnsi"/>
+          <w:sz w:val="26"/>
+          <w:szCs w:val="26"/>
+          <w:lang w:val="en-US"/>
+        </w:rPr>
+        <w:tab/>
+      </w:r>
+    </w:p>
+    <w:p>
+      <w:pPr>
+        <w:ind w:left="720"/>
+        <w:rPr>
+          <w:rFonts w:asciiTheme="majorHAnsi" w:hAnsiTheme="majorHAnsi" w:cstheme="majorHAnsi"/>
+          <w:sz w:val="26"/>
+          <w:szCs w:val="26"/>
+          <w:lang w:val="en-US"/>
+        </w:rPr>
+      </w:pPr>
+      <w:r>
+        <w:rPr>
+          <w:rFonts w:asciiTheme="majorHAnsi" w:hAnsiTheme="majorHAnsi" w:cstheme="majorHAnsi"/>
+          <w:sz w:val="26"/>
+          <w:szCs w:val="26"/>
+        </w:rPr>
+        <w:t>Dừng container</w:t>
+      </w:r>
+    </w:p>
+    <w:p>
+      <w:pPr>
+        <w:ind w:left="720"/>
+        <w:rPr>
+          <w:rFonts w:asciiTheme="majorHAnsi" w:hAnsiTheme="majorHAnsi" w:cstheme="majorHAnsi"/>
+          <w:sz w:val="26"/>
+          <w:szCs w:val="26"/>
+          <w:lang w:val="en-US"/>
+        </w:rPr>
+      </w:pPr>
+      <w:r>
+        <w:rPr>
+          <w:rFonts w:asciiTheme="majorHAnsi" w:hAnsiTheme="majorHAnsi" w:cstheme="majorHAnsi"/>
+          <w:sz w:val="26"/>
+          <w:szCs w:val="26"/>
+          <w:lang w:val="en-US"/>
+        </w:rPr>
+        <w:drawing>
+          <wp:inline distT="0" distB="0" distL="0" distR="0" wp14:anchorId="79F1A116" wp14:editId="45BDC3E0">
+            <wp:extent cx="6868484" cy="1457528"/>
+            <wp:effectExtent l="0" t="0" r="8890" b="9525"/>
+            <wp:docPr id="1623246986" name="Picture 1"/>
+            <wp:cNvGraphicFramePr>
+              <a:graphicFrameLocks xmlns:a="http://schemas.openxmlformats.org/drawingml/2006/main" noChangeAspect="1"/>
+            </wp:cNvGraphicFramePr>
+            <a:graphic xmlns:a="http://schemas.openxmlformats.org/drawingml/2006/main">
+              <a:graphicData uri="http://schemas.openxmlformats.org/drawingml/2006/picture">
+                <pic:pic xmlns:pic="http://schemas.openxmlformats.org/drawingml/2006/picture">
+                  <pic:nvPicPr>
+                    <pic:cNvPr id="1623246986" name=""/>
+                    <pic:cNvPicPr/>
+                  </pic:nvPicPr>
+                  <pic:blipFill>
+                    <a:blip r:embed="rId18"/>
+                    <a:stretch>
+                      <a:fillRect/>
+                    </a:stretch>
+                  </pic:blipFill>
+                  <pic:spPr>
+                    <a:xfrm>
+                      <a:off x="0" y="0"/>
+                      <a:ext cx="6868484" cy="1457528"/>
+                    </a:xfrm>
+                    <a:prstGeom prst="rect">
+                      <a:avLst/>
+                    </a:prstGeom>
+                  </pic:spPr>
+                </pic:pic>
+              </a:graphicData>
+            </a:graphic>
+          </wp:inline>
+        </w:drawing>
+      </w:r>
+    </w:p>
+    <w:p>
+      <w:pPr>
+        <w:pStyle w:val="ListParagraph"/>
+        <w:numPr>
+          <w:ilvl w:val="0"/>
+          <w:numId w:val="26"/>
+        </w:numPr>
+        <w:rPr>
+          <w:rFonts w:asciiTheme="majorHAnsi" w:hAnsiTheme="majorHAnsi" w:cstheme="majorHAnsi"/>
+          <w:sz w:val="26"/>
+          <w:szCs w:val="26"/>
+          <w:lang w:val="en-US"/>
+        </w:rPr>
+      </w:pPr>
+      <w:r>
+        <w:rPr>
+          <w:rFonts w:asciiTheme="majorHAnsi" w:hAnsiTheme="majorHAnsi" w:cstheme="majorHAnsi"/>
+          <w:sz w:val="26"/>
+          <w:szCs w:val="26"/>
+          <w:lang w:val="en-US"/>
+        </w:rPr>
+        <w:t>docker restart &lt;container_id&gt;</w:t>
+      </w:r>
+    </w:p>
+    <w:p>
+      <w:pPr>
+        <w:ind w:left="720"/>
+        <w:rPr>
+          <w:rFonts w:asciiTheme="majorHAnsi" w:hAnsiTheme="majorHAnsi" w:cstheme="majorHAnsi"/>
+          <w:sz w:val="26"/>
+          <w:szCs w:val="26"/>
+          <w:lang w:val="en-US"/>
+        </w:rPr>
+      </w:pPr>
+      <w:r>
+        <w:rPr>
+          <w:rFonts w:asciiTheme="majorHAnsi" w:hAnsiTheme="majorHAnsi" w:cstheme="majorHAnsi"/>
+          <w:sz w:val="26"/>
+          <w:szCs w:val="26"/>
+          <w:lang w:val="en-US"/>
+        </w:rPr>
+        <w:t>Restart container</w:t>
+      </w:r>
+    </w:p>
+    <w:p>
+      <w:pPr>
+        <w:ind w:left="720"/>
+        <w:rPr>
+          <w:rFonts w:asciiTheme="majorHAnsi" w:hAnsiTheme="majorHAnsi" w:cstheme="majorHAnsi"/>
+          <w:sz w:val="26"/>
+          <w:szCs w:val="26"/>
+          <w:lang w:val="en-US"/>
+        </w:rPr>
+      </w:pPr>
+      <w:r>
+        <w:rPr>
+          <w:rFonts w:asciiTheme="majorHAnsi" w:hAnsiTheme="majorHAnsi" w:cstheme="majorHAnsi"/>
+          <w:sz w:val="26"/>
+          <w:szCs w:val="26"/>
+          <w:lang w:val="en-US"/>
+        </w:rPr>
+        <w:drawing>
+          <wp:inline distT="0" distB="0" distL="0" distR="0" wp14:anchorId="78F586EF" wp14:editId="7E46707D">
+            <wp:extent cx="7220958" cy="933580"/>
+            <wp:effectExtent l="0" t="0" r="0" b="0"/>
+            <wp:docPr id="1891355893" name="Picture 1"/>
+            <wp:cNvGraphicFramePr>
+              <a:graphicFrameLocks xmlns:a="http://schemas.openxmlformats.org/drawingml/2006/main" noChangeAspect="1"/>
+            </wp:cNvGraphicFramePr>
+            <a:graphic xmlns:a="http://schemas.openxmlformats.org/drawingml/2006/main">
+              <a:graphicData uri="http://schemas.openxmlformats.org/drawingml/2006/picture">
+                <pic:pic xmlns:pic="http://schemas.openxmlformats.org/drawingml/2006/picture">
+                  <pic:nvPicPr>
+                    <pic:cNvPr id="1891355893" name=""/>
+                    <pic:cNvPicPr/>
+                  </pic:nvPicPr>
+                  <pic:blipFill>
+                    <a:blip r:embed="rId19"/>
+                    <a:stretch>
+                      <a:fillRect/>
+                    </a:stretch>
+                  </pic:blipFill>
+                  <pic:spPr>
+                    <a:xfrm>
+                      <a:off x="0" y="0"/>
+                      <a:ext cx="7220958" cy="933580"/>
+                    </a:xfrm>
+                    <a:prstGeom prst="rect">
+                      <a:avLst/>
+                    </a:prstGeom>
+                  </pic:spPr>
+                </pic:pic>
+              </a:graphicData>
+            </a:graphic>
+          </wp:inline>
+        </w:drawing>
+      </w:r>
+    </w:p>
+    <w:p>
+      <w:pPr>
+        <w:pStyle w:val="ListParagraph"/>
+        <w:numPr>
+          <w:ilvl w:val="0"/>
+          <w:numId w:val="26"/>
+        </w:numPr>
+        <w:rPr>
+          <w:rFonts w:asciiTheme="majorHAnsi" w:hAnsiTheme="majorHAnsi" w:cstheme="majorHAnsi"/>
+          <w:sz w:val="26"/>
+          <w:szCs w:val="26"/>
+          <w:lang w:val="en-US"/>
+        </w:rPr>
+      </w:pPr>
+      <w:r>
+        <w:rPr>
+          <w:rFonts w:asciiTheme="majorHAnsi" w:hAnsiTheme="majorHAnsi" w:cstheme="majorHAnsi"/>
+          <w:sz w:val="26"/>
+          <w:szCs w:val="26"/>
+          <w:lang w:val="en-US"/>
+        </w:rPr>
+        <w:t>docker rm &lt;container_id&gt;</w:t>
+      </w:r>
+      <w:r>
+        <w:rPr>
+          <w:rFonts w:asciiTheme="majorHAnsi" w:hAnsiTheme="majorHAnsi" w:cstheme="majorHAnsi"/>
+          <w:sz w:val="26"/>
+          <w:szCs w:val="26"/>
+          <w:lang w:val="en-US"/>
+        </w:rPr>
+        <w:tab/>
+      </w:r>
+    </w:p>
+    <w:p>
+      <w:pPr>
+        <w:ind w:left="720"/>
+        <w:rPr>
+          <w:rFonts w:asciiTheme="majorHAnsi" w:hAnsiTheme="majorHAnsi" w:cstheme="majorHAnsi"/>
+          <w:sz w:val="26"/>
+          <w:szCs w:val="26"/>
+          <w:lang w:val="en-US"/>
+        </w:rPr>
+      </w:pPr>
+      <w:r>
+        <w:rPr>
+          <w:rFonts w:asciiTheme="majorHAnsi" w:hAnsiTheme="majorHAnsi" w:cstheme="majorHAnsi"/>
+          <w:sz w:val="26"/>
+          <w:szCs w:val="26"/>
+          <w:lang w:val="en-US"/>
+        </w:rPr>
+        <w:t>Xóa container</w:t>
+      </w:r>
+    </w:p>
+    <w:p>
+      <w:pPr>
+        <w:ind w:left="720"/>
+        <w:rPr>
+          <w:rFonts w:asciiTheme="majorHAnsi" w:hAnsiTheme="majorHAnsi" w:cstheme="majorHAnsi"/>
+          <w:sz w:val="26"/>
+          <w:szCs w:val="26"/>
+          <w:lang w:val="en-US"/>
+        </w:rPr>
+      </w:pPr>
+      <w:r>
+        <w:rPr>
+          <w:rFonts w:asciiTheme="majorHAnsi" w:hAnsiTheme="majorHAnsi" w:cstheme="majorHAnsi"/>
+          <w:sz w:val="26"/>
+          <w:szCs w:val="26"/>
+          <w:lang w:val="en-US"/>
+        </w:rPr>
+        <w:lastRenderedPageBreak/>
+        <w:drawing>
+          <wp:inline distT="0" distB="0" distL="0" distR="0" wp14:anchorId="172E28B1" wp14:editId="5798F1E7">
+            <wp:extent cx="7315200" cy="454025"/>
+            <wp:effectExtent l="0" t="0" r="0" b="3175"/>
+            <wp:docPr id="1424107996" name="Picture 1"/>
+            <wp:cNvGraphicFramePr>
+              <a:graphicFrameLocks xmlns:a="http://schemas.openxmlformats.org/drawingml/2006/main" noChangeAspect="1"/>
+            </wp:cNvGraphicFramePr>
+            <a:graphic xmlns:a="http://schemas.openxmlformats.org/drawingml/2006/main">
+              <a:graphicData uri="http://schemas.openxmlformats.org/drawingml/2006/picture">
+                <pic:pic xmlns:pic="http://schemas.openxmlformats.org/drawingml/2006/picture">
+                  <pic:nvPicPr>
+                    <pic:cNvPr id="1424107996" name=""/>
+                    <pic:cNvPicPr/>
+                  </pic:nvPicPr>
+                  <pic:blipFill>
+                    <a:blip r:embed="rId20"/>
+                    <a:stretch>
+                      <a:fillRect/>
+                    </a:stretch>
+                  </pic:blipFill>
+                  <pic:spPr>
+                    <a:xfrm>
+                      <a:off x="0" y="0"/>
+                      <a:ext cx="7315200" cy="454025"/>
+                    </a:xfrm>
+                    <a:prstGeom prst="rect">
+                      <a:avLst/>
+                    </a:prstGeom>
+                  </pic:spPr>
+                </pic:pic>
+              </a:graphicData>
+            </a:graphic>
+          </wp:inline>
+        </w:drawing>
+      </w:r>
+    </w:p>
+    <w:p>
+      <w:pPr>
+        <w:pStyle w:val="ListParagraph"/>
+        <w:numPr>
+          <w:ilvl w:val="0"/>
+          <w:numId w:val="26"/>
+        </w:numPr>
+        <w:rPr>
+          <w:rFonts w:asciiTheme="majorHAnsi" w:hAnsiTheme="majorHAnsi" w:cstheme="majorHAnsi"/>
+          <w:sz w:val="26"/>
+          <w:szCs w:val="26"/>
+          <w:lang w:val="en-US"/>
+        </w:rPr>
+      </w:pPr>
+      <w:r>
+        <w:rPr>
+          <w:rFonts w:asciiTheme="majorHAnsi" w:hAnsiTheme="majorHAnsi" w:cstheme="majorHAnsi"/>
+          <w:sz w:val="26"/>
+          <w:szCs w:val="26"/>
+          <w:lang w:val="en-US"/>
+        </w:rPr>
+        <w:t>docker container prune</w:t>
+      </w:r>
+      <w:r>
+        <w:rPr>
+          <w:rFonts w:asciiTheme="majorHAnsi" w:hAnsiTheme="majorHAnsi" w:cstheme="majorHAnsi"/>
+          <w:sz w:val="26"/>
+          <w:szCs w:val="26"/>
+          <w:lang w:val="en-US"/>
+        </w:rPr>
+        <w:tab/>
+      </w:r>
+    </w:p>
+    <w:p>
+      <w:pPr>
+        <w:ind w:left="720"/>
+        <w:rPr>
+          <w:rFonts w:asciiTheme="majorHAnsi" w:hAnsiTheme="majorHAnsi" w:cstheme="majorHAnsi"/>
+          <w:sz w:val="26"/>
+          <w:szCs w:val="26"/>
+          <w:lang w:val="en-US"/>
+        </w:rPr>
+      </w:pPr>
+      <w:r>
+        <w:rPr>
+          <w:rFonts w:asciiTheme="majorHAnsi" w:hAnsiTheme="majorHAnsi" w:cstheme="majorHAnsi"/>
+          <w:sz w:val="26"/>
+          <w:szCs w:val="26"/>
+          <w:lang w:val="en-US"/>
+        </w:rPr>
+        <w:t>Xóa tất cả container</w:t>
+      </w:r>
+    </w:p>
+    <w:p>
+      <w:pPr>
+        <w:ind w:left="720"/>
+        <w:rPr>
+          <w:rFonts w:asciiTheme="majorHAnsi" w:hAnsiTheme="majorHAnsi" w:cstheme="majorHAnsi"/>
+          <w:sz w:val="26"/>
+          <w:szCs w:val="26"/>
+          <w:lang w:val="en-US"/>
+        </w:rPr>
+      </w:pPr>
+      <w:r>
+        <w:rPr>
+          <w:rFonts w:asciiTheme="majorHAnsi" w:hAnsiTheme="majorHAnsi" w:cstheme="majorHAnsi"/>
+          <w:sz w:val="26"/>
+          <w:szCs w:val="26"/>
+          <w:lang w:val="en-US"/>
+        </w:rPr>
+        <w:drawing>
+          <wp:inline distT="0" distB="0" distL="0" distR="0" wp14:anchorId="5D21C613" wp14:editId="73B8A83B">
+            <wp:extent cx="6554115" cy="666843"/>
+            <wp:effectExtent l="0" t="0" r="0" b="0"/>
+            <wp:docPr id="84977032" name="Picture 1"/>
+            <wp:cNvGraphicFramePr>
+              <a:graphicFrameLocks xmlns:a="http://schemas.openxmlformats.org/drawingml/2006/main" noChangeAspect="1"/>
+            </wp:cNvGraphicFramePr>
+            <a:graphic xmlns:a="http://schemas.openxmlformats.org/drawingml/2006/main">
+              <a:graphicData uri="http://schemas.openxmlformats.org/drawingml/2006/picture">
+                <pic:pic xmlns:pic="http://schemas.openxmlformats.org/drawingml/2006/picture">
+                  <pic:nvPicPr>
+                    <pic:cNvPr id="84977032" name=""/>
+                    <pic:cNvPicPr/>
+                  </pic:nvPicPr>
+                  <pic:blipFill>
+                    <a:blip r:embed="rId21"/>
+                    <a:stretch>
+                      <a:fillRect/>
+                    </a:stretch>
+                  </pic:blipFill>
+                  <pic:spPr>
+                    <a:xfrm>
+                      <a:off x="0" y="0"/>
+                      <a:ext cx="6554115" cy="666843"/>
+                    </a:xfrm>
+                    <a:prstGeom prst="rect">
+                      <a:avLst/>
+                    </a:prstGeom>
+                  </pic:spPr>
+                </pic:pic>
+              </a:graphicData>
+            </a:graphic>
+          </wp:inline>
+        </w:drawing>
+      </w:r>
+    </w:p>
+    <w:p>
+      <w:pPr>
+        <w:rPr>
+          <w:rFonts w:asciiTheme="majorHAnsi" w:hAnsiTheme="majorHAnsi" w:cstheme="majorHAnsi"/>
+          <w:sz w:val="26"/>
+          <w:szCs w:val="26"/>
+          <w:lang w:val="en-US"/>
+        </w:rPr>
+      </w:pPr>
+      <w:r>
+        <w:rPr>
+          <w:rFonts w:asciiTheme="majorHAnsi" w:hAnsiTheme="majorHAnsi" w:cstheme="majorHAnsi"/>
+          <w:sz w:val="26"/>
+          <w:szCs w:val="26"/>
+          <w:lang w:val="en-US"/>
+        </w:rPr>
+        <w:tab/>
+        <w:t>14</w:t>
+      </w:r>
+      <w:r>
+        <w:rPr>
+          <w:rFonts w:asciiTheme="majorHAnsi" w:hAnsiTheme="majorHAnsi" w:cstheme="majorHAnsi"/>
+          <w:sz w:val="26"/>
+          <w:szCs w:val="26"/>
+          <w:lang w:val="en-US"/>
+        </w:rPr>
+        <w:tab/>
+        <w:t>docker rmi &lt;image_id&gt;</w:t>
+      </w:r>
+      <w:r>
+        <w:rPr>
+          <w:rFonts w:asciiTheme="majorHAnsi" w:hAnsiTheme="majorHAnsi" w:cstheme="majorHAnsi"/>
+          <w:sz w:val="26"/>
+          <w:szCs w:val="26"/>
+          <w:lang w:val="en-US"/>
+        </w:rPr>
+        <w:tab/>
+      </w:r>
+    </w:p>
+    <w:p>
+      <w:pPr>
+        <w:rPr>
+          <w:rFonts w:asciiTheme="majorHAnsi" w:hAnsiTheme="majorHAnsi" w:cstheme="majorHAnsi"/>
+          <w:sz w:val="26"/>
+          <w:szCs w:val="26"/>
+          <w:lang w:val="en-US"/>
+        </w:rPr>
+      </w:pPr>
+      <w:r>
+        <w:rPr>
+          <w:rFonts w:asciiTheme="majorHAnsi" w:hAnsiTheme="majorHAnsi" w:cstheme="majorHAnsi"/>
+          <w:sz w:val="26"/>
+          <w:szCs w:val="26"/>
+          <w:lang w:val="en-US"/>
+        </w:rPr>
+        <w:tab/>
+        <w:t>15</w:t>
+      </w:r>
+      <w:r>
+        <w:rPr>
+          <w:rFonts w:asciiTheme="majorHAnsi" w:hAnsiTheme="majorHAnsi" w:cstheme="majorHAnsi"/>
+          <w:sz w:val="26"/>
+          <w:szCs w:val="26"/>
+          <w:lang w:val="en-US"/>
+        </w:rPr>
+        <w:tab/>
+        <w:t>docker image prune -a</w:t>
+      </w:r>
+      <w:r>
+        <w:rPr>
+          <w:rFonts w:asciiTheme="majorHAnsi" w:hAnsiTheme="majorHAnsi" w:cstheme="majorHAnsi"/>
+          <w:sz w:val="26"/>
+          <w:szCs w:val="26"/>
+          <w:lang w:val="en-US"/>
+        </w:rPr>
+        <w:tab/>
+      </w:r>
+    </w:p>
+    <w:p>
+      <w:pPr>
+        <w:rPr>
+          <w:rFonts w:asciiTheme="majorHAnsi" w:hAnsiTheme="majorHAnsi" w:cstheme="majorHAnsi"/>
+          <w:sz w:val="26"/>
+          <w:szCs w:val="26"/>
+          <w:lang w:val="en-US"/>
+        </w:rPr>
+      </w:pPr>
+      <w:r>
+        <w:rPr>
+          <w:rFonts w:asciiTheme="majorHAnsi" w:hAnsiTheme="majorHAnsi" w:cstheme="majorHAnsi"/>
+          <w:sz w:val="26"/>
+          <w:szCs w:val="26"/>
+          <w:lang w:val="en-US"/>
+        </w:rPr>
+        <w:tab/>
+        <w:t>16</w:t>
+      </w:r>
+      <w:r>
+        <w:rPr>
+          <w:rFonts w:asciiTheme="majorHAnsi" w:hAnsiTheme="majorHAnsi" w:cstheme="majorHAnsi"/>
+          <w:sz w:val="26"/>
+          <w:szCs w:val="26"/>
+          <w:lang w:val="en-US"/>
+        </w:rPr>
+        <w:tab/>
+        <w:t>docker run -d -p 8080:80 nginx</w:t>
+      </w:r>
+      <w:r>
+        <w:rPr>
+          <w:rFonts w:asciiTheme="majorHAnsi" w:hAnsiTheme="majorHAnsi" w:cstheme="majorHAnsi"/>
+          <w:sz w:val="26"/>
+          <w:szCs w:val="26"/>
+          <w:lang w:val="en-US"/>
+        </w:rPr>
+        <w:tab/>
+      </w:r>
+    </w:p>
+    <w:p>
+      <w:pPr>
+        <w:rPr>
+          <w:rFonts w:asciiTheme="majorHAnsi" w:hAnsiTheme="majorHAnsi" w:cstheme="majorHAnsi"/>
+          <w:sz w:val="26"/>
+          <w:szCs w:val="26"/>
+          <w:lang w:val="en-US"/>
+        </w:rPr>
+      </w:pPr>
+      <w:r>
+        <w:rPr>
+          <w:rFonts w:asciiTheme="majorHAnsi" w:hAnsiTheme="majorHAnsi" w:cstheme="majorHAnsi"/>
+          <w:sz w:val="26"/>
+          <w:szCs w:val="26"/>
+          <w:lang w:val="en-US"/>
+        </w:rPr>
+        <w:tab/>
+        <w:t>17</w:t>
+      </w:r>
+      <w:r>
+        <w:rPr>
+          <w:rFonts w:asciiTheme="majorHAnsi" w:hAnsiTheme="majorHAnsi" w:cstheme="majorHAnsi"/>
+          <w:sz w:val="26"/>
+          <w:szCs w:val="26"/>
+          <w:lang w:val="en-US"/>
+        </w:rPr>
+        <w:tab/>
+        <w:t>docker inspect &lt;container_id&gt;</w:t>
+      </w:r>
+      <w:r>
+        <w:rPr>
+          <w:rFonts w:asciiTheme="majorHAnsi" w:hAnsiTheme="majorHAnsi" w:cstheme="majorHAnsi"/>
+          <w:sz w:val="26"/>
+          <w:szCs w:val="26"/>
+          <w:lang w:val="en-US"/>
+        </w:rPr>
+        <w:tab/>
+      </w:r>
+    </w:p>
+    <w:p>
+      <w:pPr>
+        <w:rPr>
+          <w:rFonts w:asciiTheme="majorHAnsi" w:hAnsiTheme="majorHAnsi" w:cstheme="majorHAnsi"/>
+          <w:sz w:val="26"/>
+          <w:szCs w:val="26"/>
+          <w:lang w:val="en-US"/>
+        </w:rPr>
+      </w:pPr>
+      <w:r>
+        <w:rPr>
+          <w:rFonts w:asciiTheme="majorHAnsi" w:hAnsiTheme="majorHAnsi" w:cstheme="majorHAnsi"/>
+          <w:sz w:val="26"/>
+          <w:szCs w:val="26"/>
+          <w:lang w:val="en-US"/>
+        </w:rPr>
+        <w:tab/>
+        <w:t>18</w:t>
+      </w:r>
+      <w:r>
+        <w:rPr>
+          <w:rFonts w:asciiTheme="majorHAnsi" w:hAnsiTheme="majorHAnsi" w:cstheme="majorHAnsi"/>
+          <w:sz w:val="26"/>
+          <w:szCs w:val="26"/>
+          <w:lang w:val="en-US"/>
+        </w:rPr>
+        <w:tab/>
+        <w:t>docker run -d -v mydata:/data nginx</w:t>
+      </w:r>
+      <w:r>
+        <w:rPr>
+          <w:rFonts w:asciiTheme="majorHAnsi" w:hAnsiTheme="majorHAnsi" w:cstheme="majorHAnsi"/>
+          <w:sz w:val="26"/>
+          <w:szCs w:val="26"/>
+          <w:lang w:val="en-US"/>
+        </w:rPr>
+        <w:tab/>
+      </w:r>
+    </w:p>
+    <w:p>
+      <w:pPr>
+        <w:rPr>
+          <w:rFonts w:asciiTheme="majorHAnsi" w:hAnsiTheme="majorHAnsi" w:cstheme="majorHAnsi"/>
+          <w:sz w:val="26"/>
+          <w:szCs w:val="26"/>
+          <w:lang w:val="en-US"/>
+        </w:rPr>
+      </w:pPr>
+      <w:r>
+        <w:rPr>
+          <w:rFonts w:asciiTheme="majorHAnsi" w:hAnsiTheme="majorHAnsi" w:cstheme="majorHAnsi"/>
+          <w:sz w:val="26"/>
+          <w:szCs w:val="26"/>
+          <w:lang w:val="en-US"/>
+        </w:rPr>
+        <w:tab/>
+        <w:t>19</w:t>
+      </w:r>
+      <w:r>
+        <w:rPr>
+          <w:rFonts w:asciiTheme="majorHAnsi" w:hAnsiTheme="majorHAnsi" w:cstheme="majorHAnsi"/>
+          <w:sz w:val="26"/>
+          <w:szCs w:val="26"/>
+          <w:lang w:val="en-US"/>
+        </w:rPr>
+        <w:tab/>
+        <w:t>docker volume ls</w:t>
+      </w:r>
+      <w:r>
+        <w:rPr>
+          <w:rFonts w:asciiTheme="majorHAnsi" w:hAnsiTheme="majorHAnsi" w:cstheme="majorHAnsi"/>
+          <w:sz w:val="26"/>
+          <w:szCs w:val="26"/>
+          <w:lang w:val="en-US"/>
+        </w:rPr>
+        <w:tab/>
+      </w:r>
+    </w:p>
+    <w:p>
+      <w:pPr>
+        <w:rPr>
+          <w:rFonts w:asciiTheme="majorHAnsi" w:hAnsiTheme="majorHAnsi" w:cstheme="majorHAnsi"/>
+          <w:sz w:val="26"/>
+          <w:szCs w:val="26"/>
+          <w:lang w:val="en-US"/>
+        </w:rPr>
+      </w:pPr>
+      <w:r>
+        <w:rPr>
+          <w:rFonts w:asciiTheme="majorHAnsi" w:hAnsiTheme="majorHAnsi" w:cstheme="majorHAnsi"/>
+          <w:sz w:val="26"/>
+          <w:szCs w:val="26"/>
+          <w:lang w:val="en-US"/>
+        </w:rPr>
+        <w:tab/>
+        <w:t>20</w:t>
+      </w:r>
+      <w:r>
+        <w:rPr>
+          <w:rFonts w:asciiTheme="majorHAnsi" w:hAnsiTheme="majorHAnsi" w:cstheme="majorHAnsi"/>
+          <w:sz w:val="26"/>
+          <w:szCs w:val="26"/>
+          <w:lang w:val="en-US"/>
+        </w:rPr>
+        <w:tab/>
+        <w:t>docker volume prune</w:t>
+      </w:r>
+      <w:r>
+        <w:rPr>
+          <w:rFonts w:asciiTheme="majorHAnsi" w:hAnsiTheme="majorHAnsi" w:cstheme="majorHAnsi"/>
+          <w:sz w:val="26"/>
+          <w:szCs w:val="26"/>
+          <w:lang w:val="en-US"/>
+        </w:rPr>
+        <w:tab/>
+      </w:r>
+    </w:p>
+    <w:p>
+      <w:pPr>
+        <w:rPr>
+          <w:rFonts w:asciiTheme="majorHAnsi" w:hAnsiTheme="majorHAnsi" w:cstheme="majorHAnsi"/>
+          <w:sz w:val="26"/>
+          <w:szCs w:val="26"/>
+          <w:lang w:val="en-US"/>
+        </w:rPr>
+      </w:pPr>
+      <w:r>
+        <w:rPr>
+          <w:rFonts w:asciiTheme="majorHAnsi" w:hAnsiTheme="majorHAnsi" w:cstheme="majorHAnsi"/>
+          <w:sz w:val="26"/>
+          <w:szCs w:val="26"/>
+          <w:lang w:val="en-US"/>
+        </w:rPr>
+        <w:tab/>
+        <w:t>21</w:t>
+      </w:r>
+      <w:r>
+        <w:rPr>
+          <w:rFonts w:asciiTheme="majorHAnsi" w:hAnsiTheme="majorHAnsi" w:cstheme="majorHAnsi"/>
+          <w:sz w:val="26"/>
+          <w:szCs w:val="26"/>
+          <w:lang w:val="en-US"/>
+        </w:rPr>
+        <w:tab/>
+        <w:t>docker run -d --name my_nginx nginx</w:t>
+      </w:r>
+      <w:r>
+        <w:rPr>
+          <w:rFonts w:asciiTheme="majorHAnsi" w:hAnsiTheme="majorHAnsi" w:cstheme="majorHAnsi"/>
+          <w:sz w:val="26"/>
+          <w:szCs w:val="26"/>
+          <w:lang w:val="en-US"/>
+        </w:rPr>
+        <w:tab/>
+      </w:r>
+    </w:p>
+    <w:p>
+      <w:pPr>
+        <w:rPr>
+          <w:rFonts w:asciiTheme="majorHAnsi" w:hAnsiTheme="majorHAnsi" w:cstheme="majorHAnsi"/>
+          <w:sz w:val="26"/>
+          <w:szCs w:val="26"/>
+          <w:lang w:val="en-US"/>
+        </w:rPr>
+      </w:pPr>
+      <w:r>
+        <w:rPr>
+          <w:rFonts w:asciiTheme="majorHAnsi" w:hAnsiTheme="majorHAnsi" w:cstheme="majorHAnsi"/>
+          <w:sz w:val="26"/>
+          <w:szCs w:val="26"/>
+          <w:lang w:val="en-US"/>
+        </w:rPr>
+        <w:tab/>
+        <w:t>22</w:t>
+      </w:r>
+      <w:r>
+        <w:rPr>
+          <w:rFonts w:asciiTheme="majorHAnsi" w:hAnsiTheme="majorHAnsi" w:cstheme="majorHAnsi"/>
+          <w:sz w:val="26"/>
+          <w:szCs w:val="26"/>
+          <w:lang w:val="en-US"/>
+        </w:rPr>
+        <w:tab/>
+        <w:t>docker stats</w:t>
+      </w:r>
+      <w:r>
+        <w:rPr>
+          <w:rFonts w:asciiTheme="majorHAnsi" w:hAnsiTheme="majorHAnsi" w:cstheme="majorHAnsi"/>
+          <w:sz w:val="26"/>
+          <w:szCs w:val="26"/>
+          <w:lang w:val="en-US"/>
+        </w:rPr>
+        <w:tab/>
+      </w:r>
+    </w:p>
+    <w:p>
+      <w:pPr>
+        <w:rPr>
+          <w:rFonts w:asciiTheme="majorHAnsi" w:hAnsiTheme="majorHAnsi" w:cstheme="majorHAnsi"/>
+          <w:sz w:val="26"/>
+          <w:szCs w:val="26"/>
+          <w:lang w:val="en-US"/>
+        </w:rPr>
+      </w:pPr>
+      <w:r>
+        <w:rPr>
+          <w:rFonts w:asciiTheme="majorHAnsi" w:hAnsiTheme="majorHAnsi" w:cstheme="majorHAnsi"/>
+          <w:sz w:val="26"/>
+          <w:szCs w:val="26"/>
+          <w:lang w:val="en-US"/>
+        </w:rPr>
+        <w:tab/>
+        <w:t>23</w:t>
+      </w:r>
+      <w:r>
+        <w:rPr>
+          <w:rFonts w:asciiTheme="majorHAnsi" w:hAnsiTheme="majorHAnsi" w:cstheme="majorHAnsi"/>
+          <w:sz w:val="26"/>
+          <w:szCs w:val="26"/>
+          <w:lang w:val="en-US"/>
+        </w:rPr>
+        <w:tab/>
+        <w:t>docker network ls</w:t>
+      </w:r>
+      <w:r>
+        <w:rPr>
+          <w:rFonts w:asciiTheme="majorHAnsi" w:hAnsiTheme="majorHAnsi" w:cstheme="majorHAnsi"/>
+          <w:sz w:val="26"/>
+          <w:szCs w:val="26"/>
+          <w:lang w:val="en-US"/>
+        </w:rPr>
+        <w:tab/>
+      </w:r>
+    </w:p>
+    <w:p>
+      <w:pPr>
+        <w:rPr>
+          <w:rFonts w:asciiTheme="majorHAnsi" w:hAnsiTheme="majorHAnsi" w:cstheme="majorHAnsi"/>
+          <w:sz w:val="26"/>
+          <w:szCs w:val="26"/>
+          <w:lang w:val="en-US"/>
+        </w:rPr>
+      </w:pPr>
+      <w:r>
+        <w:rPr>
+          <w:rFonts w:asciiTheme="majorHAnsi" w:hAnsiTheme="majorHAnsi" w:cstheme="majorHAnsi"/>
+          <w:sz w:val="26"/>
+          <w:szCs w:val="26"/>
+          <w:lang w:val="en-US"/>
+        </w:rPr>
+        <w:tab/>
+        <w:t>24</w:t>
+      </w:r>
+      <w:r>
+        <w:rPr>
+          <w:rFonts w:asciiTheme="majorHAnsi" w:hAnsiTheme="majorHAnsi" w:cstheme="majorHAnsi"/>
+          <w:sz w:val="26"/>
+          <w:szCs w:val="26"/>
+          <w:lang w:val="en-US"/>
+        </w:rPr>
+        <w:tab/>
+        <w:t>docker network create my_network</w:t>
+      </w:r>
+      <w:r>
+        <w:rPr>
+          <w:rFonts w:asciiTheme="majorHAnsi" w:hAnsiTheme="majorHAnsi" w:cstheme="majorHAnsi"/>
+          <w:sz w:val="26"/>
+          <w:szCs w:val="26"/>
+          <w:lang w:val="en-US"/>
+        </w:rPr>
+        <w:tab/>
+      </w:r>
+    </w:p>
+    <w:p>
+      <w:pPr>
+        <w:rPr>
+          <w:rFonts w:asciiTheme="majorHAnsi" w:hAnsiTheme="majorHAnsi" w:cstheme="majorHAnsi"/>
+          <w:sz w:val="26"/>
+          <w:szCs w:val="26"/>
+          <w:lang w:val="en-US"/>
+        </w:rPr>
+      </w:pPr>
+      <w:r>
+        <w:rPr>
+          <w:rFonts w:asciiTheme="majorHAnsi" w:hAnsiTheme="majorHAnsi" w:cstheme="majorHAnsi"/>
+          <w:sz w:val="26"/>
+          <w:szCs w:val="26"/>
+          <w:lang w:val="en-US"/>
+        </w:rPr>
+        <w:tab/>
+        <w:t>25</w:t>
+      </w:r>
+      <w:r>
+        <w:rPr>
+          <w:rFonts w:asciiTheme="majorHAnsi" w:hAnsiTheme="majorHAnsi" w:cstheme="majorHAnsi"/>
+          <w:sz w:val="26"/>
+          <w:szCs w:val="26"/>
+          <w:lang w:val="en-US"/>
+        </w:rPr>
+        <w:tab/>
+        <w:t>docker run -d --network my_network --name my_container nginx</w:t>
+      </w:r>
+      <w:r>
+        <w:rPr>
+          <w:rFonts w:asciiTheme="majorHAnsi" w:hAnsiTheme="majorHAnsi" w:cstheme="majorHAnsi"/>
+          <w:sz w:val="26"/>
+          <w:szCs w:val="26"/>
+          <w:lang w:val="en-US"/>
+        </w:rPr>
+        <w:tab/>
+      </w:r>
+    </w:p>
+    <w:p>
+      <w:pPr>
+        <w:rPr>
+          <w:rFonts w:asciiTheme="majorHAnsi" w:hAnsiTheme="majorHAnsi" w:cstheme="majorHAnsi"/>
+          <w:sz w:val="26"/>
+          <w:szCs w:val="26"/>
+          <w:lang w:val="en-US"/>
+        </w:rPr>
+      </w:pPr>
+      <w:r>
+        <w:rPr>
+          <w:rFonts w:asciiTheme="majorHAnsi" w:hAnsiTheme="majorHAnsi" w:cstheme="majorHAnsi"/>
+          <w:sz w:val="26"/>
+          <w:szCs w:val="26"/>
+          <w:lang w:val="en-US"/>
+        </w:rPr>
+        <w:tab/>
+        <w:t>26</w:t>
+      </w:r>
+      <w:r>
+        <w:rPr>
+          <w:rFonts w:asciiTheme="majorHAnsi" w:hAnsiTheme="majorHAnsi" w:cstheme="majorHAnsi"/>
+          <w:sz w:val="26"/>
+          <w:szCs w:val="26"/>
+          <w:lang w:val="en-US"/>
+        </w:rPr>
+        <w:tab/>
+        <w:t>docker network connect my_network my_nginx</w:t>
+      </w:r>
+      <w:r>
+        <w:rPr>
+          <w:rFonts w:asciiTheme="majorHAnsi" w:hAnsiTheme="majorHAnsi" w:cstheme="majorHAnsi"/>
+          <w:sz w:val="26"/>
+          <w:szCs w:val="26"/>
+          <w:lang w:val="en-US"/>
+        </w:rPr>
+        <w:tab/>
+      </w:r>
+    </w:p>
+    <w:p>
+      <w:pPr>
+        <w:rPr>
+          <w:rFonts w:asciiTheme="majorHAnsi" w:hAnsiTheme="majorHAnsi" w:cstheme="majorHAnsi"/>
+          <w:sz w:val="26"/>
+          <w:szCs w:val="26"/>
+          <w:lang w:val="en-US"/>
+        </w:rPr>
+      </w:pPr>
+      <w:r>
+        <w:rPr>
+          <w:rFonts w:asciiTheme="majorHAnsi" w:hAnsiTheme="majorHAnsi" w:cstheme="majorHAnsi"/>
+          <w:sz w:val="26"/>
+          <w:szCs w:val="26"/>
+          <w:lang w:val="en-US"/>
+        </w:rPr>
+        <w:tab/>
+        <w:t>27</w:t>
+      </w:r>
+      <w:r>
+        <w:rPr>
+          <w:rFonts w:asciiTheme="majorHAnsi" w:hAnsiTheme="majorHAnsi" w:cstheme="majorHAnsi"/>
+          <w:sz w:val="26"/>
+          <w:szCs w:val="26"/>
+          <w:lang w:val="en-US"/>
+        </w:rPr>
+        <w:tab/>
+        <w:t>docker run -d -e MY_ENV=hello_world nginx</w:t>
+      </w:r>
+      <w:r>
+        <w:rPr>
+          <w:rFonts w:asciiTheme="majorHAnsi" w:hAnsiTheme="majorHAnsi" w:cstheme="majorHAnsi"/>
+          <w:sz w:val="26"/>
+          <w:szCs w:val="26"/>
+          <w:lang w:val="en-US"/>
+        </w:rPr>
+        <w:tab/>
+      </w:r>
+    </w:p>
+    <w:p>
+      <w:pPr>
+        <w:rPr>
+          <w:rFonts w:asciiTheme="majorHAnsi" w:hAnsiTheme="majorHAnsi" w:cstheme="majorHAnsi"/>
+          <w:sz w:val="26"/>
+          <w:szCs w:val="26"/>
+          <w:lang w:val="en-US"/>
+        </w:rPr>
+      </w:pPr>
+      <w:r>
+        <w:rPr>
+          <w:rFonts w:asciiTheme="majorHAnsi" w:hAnsiTheme="majorHAnsi" w:cstheme="majorHAnsi"/>
+          <w:sz w:val="26"/>
+          <w:szCs w:val="26"/>
+          <w:lang w:val="en-US"/>
+        </w:rPr>
+        <w:tab/>
+        <w:t>28</w:t>
+      </w:r>
+      <w:r>
+        <w:rPr>
+          <w:rFonts w:asciiTheme="majorHAnsi" w:hAnsiTheme="majorHAnsi" w:cstheme="majorHAnsi"/>
+          <w:sz w:val="26"/>
+          <w:szCs w:val="26"/>
+          <w:lang w:val="en-US"/>
+        </w:rPr>
+        <w:tab/>
+        <w:t>docker logs -f my_nginx</w:t>
+      </w:r>
+      <w:r>
+        <w:rPr>
+          <w:rFonts w:asciiTheme="majorHAnsi" w:hAnsiTheme="majorHAnsi" w:cstheme="majorHAnsi"/>
+          <w:sz w:val="26"/>
+          <w:szCs w:val="26"/>
+          <w:lang w:val="en-US"/>
+        </w:rPr>
+        <w:tab/>
+      </w:r>
+    </w:p>
+    <w:p>
+      <w:pPr>
+        <w:rPr>
+          <w:rFonts w:asciiTheme="majorHAnsi" w:hAnsiTheme="majorHAnsi" w:cstheme="majorHAnsi"/>
+          <w:sz w:val="26"/>
+          <w:szCs w:val="26"/>
+          <w:lang w:val="en-US"/>
+        </w:rPr>
+      </w:pPr>
+      <w:r>
+        <w:rPr>
+          <w:rFonts w:asciiTheme="majorHAnsi" w:hAnsiTheme="majorHAnsi" w:cstheme="majorHAnsi"/>
+          <w:sz w:val="26"/>
+          <w:szCs w:val="26"/>
+          <w:lang w:val="en-US"/>
+        </w:rPr>
+        <w:tab/>
+        <w:t>29</w:t>
+      </w:r>
+      <w:r>
+        <w:rPr>
+          <w:rFonts w:asciiTheme="majorHAnsi" w:hAnsiTheme="majorHAnsi" w:cstheme="majorHAnsi"/>
+          <w:sz w:val="26"/>
+          <w:szCs w:val="26"/>
+          <w:lang w:val="en-US"/>
+        </w:rPr>
+        <w:tab/>
+        <w:t>FROM nginx</w:t>
+      </w:r>
+      <w:r>
+        <w:rPr>
+          <w:rFonts w:asciiTheme="majorHAnsi" w:hAnsiTheme="majorHAnsi" w:cstheme="majorHAnsi"/>
+          <w:sz w:val="26"/>
+          <w:szCs w:val="26"/>
+          <w:lang w:val="en-US"/>
+        </w:rPr>
+        <w:tab/>
+      </w:r>
+    </w:p>
+    <w:p>
+      <w:pPr>
+        <w:rPr>
+          <w:rFonts w:asciiTheme="majorHAnsi" w:hAnsiTheme="majorHAnsi" w:cstheme="majorHAnsi"/>
+          <w:sz w:val="26"/>
+          <w:szCs w:val="26"/>
+          <w:lang w:val="en-US"/>
+        </w:rPr>
+      </w:pPr>
+      <w:r>
+        <w:rPr>
+          <w:rFonts w:asciiTheme="majorHAnsi" w:hAnsiTheme="majorHAnsi" w:cstheme="majorHAnsi"/>
+          <w:sz w:val="26"/>
+          <w:szCs w:val="26"/>
+          <w:lang w:val="en-US"/>
+        </w:rPr>
+        <w:tab/>
+      </w:r>
+      <w:r>
+        <w:rPr>
+          <w:rFonts w:asciiTheme="majorHAnsi" w:hAnsiTheme="majorHAnsi" w:cstheme="majorHAnsi"/>
+          <w:sz w:val="26"/>
+          <w:szCs w:val="26"/>
+          <w:lang w:val="en-US"/>
+        </w:rPr>
+        <w:tab/>
+        <w:t>COPY index.html /usr/share/nginx/html/index.html</w:t>
+      </w:r>
+      <w:r>
+        <w:rPr>
+          <w:rFonts w:asciiTheme="majorHAnsi" w:hAnsiTheme="majorHAnsi" w:cstheme="majorHAnsi"/>
+          <w:sz w:val="26"/>
+          <w:szCs w:val="26"/>
+          <w:lang w:val="en-US"/>
+        </w:rPr>
+        <w:tab/>
+      </w:r>
+    </w:p>
+    <w:p>
+      <w:pPr>
+        <w:rPr>
+          <w:rFonts w:asciiTheme="majorHAnsi" w:hAnsiTheme="majorHAnsi" w:cstheme="majorHAnsi"/>
+          <w:sz w:val="26"/>
+          <w:szCs w:val="26"/>
+          <w:lang w:val="en-US"/>
+        </w:rPr>
+      </w:pPr>
+      <w:r>
+        <w:rPr>
+          <w:rFonts w:asciiTheme="majorHAnsi" w:hAnsiTheme="majorHAnsi" w:cstheme="majorHAnsi"/>
+          <w:sz w:val="26"/>
+          <w:szCs w:val="26"/>
+          <w:lang w:val="en-US"/>
+        </w:rPr>
+        <w:tab/>
+        <w:t>30</w:t>
+      </w:r>
+      <w:r>
+        <w:rPr>
+          <w:rFonts w:asciiTheme="majorHAnsi" w:hAnsiTheme="majorHAnsi" w:cstheme="majorHAnsi"/>
+          <w:sz w:val="26"/>
+          <w:szCs w:val="26"/>
+          <w:lang w:val="en-US"/>
+        </w:rPr>
+        <w:tab/>
+        <w:t>docker build -t my_nginx_image .</w:t>
+      </w:r>
+      <w:r>
+        <w:rPr>
+          <w:rFonts w:asciiTheme="majorHAnsi" w:hAnsiTheme="majorHAnsi" w:cstheme="majorHAnsi"/>
+          <w:sz w:val="26"/>
+          <w:szCs w:val="26"/>
+          <w:lang w:val="en-US"/>
+        </w:rPr>
+        <w:tab/>
+      </w:r>
+    </w:p>
+    <w:p>
+      <w:pPr>
+        <w:rPr>
+          <w:rFonts w:asciiTheme="majorHAnsi" w:hAnsiTheme="majorHAnsi" w:cstheme="majorHAnsi"/>
+          <w:sz w:val="26"/>
+          <w:szCs w:val="26"/>
+          <w:lang w:val="en-US"/>
+        </w:rPr>
+      </w:pPr>
+      <w:r>
+        <w:rPr>
+          <w:rFonts w:asciiTheme="majorHAnsi" w:hAnsiTheme="majorHAnsi" w:cstheme="majorHAnsi"/>
+          <w:sz w:val="26"/>
+          <w:szCs w:val="26"/>
+          <w:lang w:val="en-US"/>
+        </w:rPr>
+        <w:tab/>
+        <w:t>31</w:t>
+      </w:r>
+      <w:r>
+        <w:rPr>
+          <w:rFonts w:asciiTheme="majorHAnsi" w:hAnsiTheme="majorHAnsi" w:cstheme="majorHAnsi"/>
+          <w:sz w:val="26"/>
+          <w:szCs w:val="26"/>
+          <w:lang w:val="en-US"/>
+        </w:rPr>
+        <w:tab/>
+        <w:t>docker run -d -p 8080:80 my_nginx_image</w:t>
+      </w:r>
+      <w:r>
+        <w:rPr>
+          <w:rFonts w:asciiTheme="majorHAnsi" w:hAnsiTheme="majorHAnsi" w:cstheme="majorHAnsi"/>
+          <w:sz w:val="26"/>
+          <w:szCs w:val="26"/>
+          <w:lang w:val="en-US"/>
+        </w:rPr>
+        <w:tab/>
+      </w:r>
     </w:p>
     <w:sectPr>
       <w:type w:val="continuous"/>
@@ -1413,6 +3463,92 @@
 <file path=word/numbering.xml><?xml version="1.0" encoding="utf-8"?>
 <w:numbering xmlns:wpc="http://schemas.microsoft.com/office/word/2010/wordprocessingCanvas" xmlns:cx="http://schemas.microsoft.com/office/drawing/2014/chartex" xmlns:cx1="http://schemas.microsoft.com/office/drawing/2015/9/8/chartex" xmlns:cx2="http://schemas.microsoft.com/office/drawing/2015/10/21/chartex" xmlns:cx3="http://schemas.microsoft.com/office/drawing/2016/5/9/chartex" xmlns:cx4="http://schemas.microsoft.com/office/drawing/2016/5/10/chartex" xmlns:cx5="http://schemas.microsoft.com/office/drawing/2016/5/11/chartex" xmlns:cx6="http://schemas.microsoft.com/office/drawing/2016/5/12/chartex" xmlns:cx7="http://schemas.microsoft.com/office/drawing/2016/5/13/chartex" xmlns:cx8="http://schemas.microsoft.com/office/drawing/2016/5/14/chartex" xmlns:mc="http://schemas.openxmlformats.org/markup-compatibility/2006" xmlns:aink="http://schemas.microsoft.com/office/drawing/2016/ink" xmlns:am3d="http://schemas.microsoft.com/office/drawing/2017/model3d" xmlns:o="urn:schemas-microsoft-com:office:office" xmlns:oel="http://schemas.microsoft.com/office/2019/extlst" xmlns:r="http://schemas.openxmlformats.org/officeDocument/2006/relationships" xmlns:m="http://schemas.openxmlformats.org/officeDocument/2006/math" xmlns:v="urn:schemas-microsoft-com:vml" xmlns:wp14="http://schemas.microsoft.com/office/word/2010/wordprocessingDrawing" xmlns:wp="http://schemas.openxmlformats.org/drawingml/2006/wordprocessingDrawing" xmlns:w10="urn:schemas-microsoft-com:office:word" xmlns:w="http://schemas.openxmlformats.org/wordprocessingml/2006/main" xmlns:w14="http://schemas.microsoft.com/office/word/2010/wordml" xmlns:w15="http://schemas.microsoft.com/office/word/2012/wordml" xmlns:w16cex="http://schemas.microsoft.com/office/word/2018/wordml/cex" xmlns:w16cid="http://schemas.microsoft.com/office/word/2016/wordml/cid" xmlns:w16="http://schemas.microsoft.com/office/word/2018/wordml" xmlns:w16du="http://schemas.microsoft.com/office/word/2023/wordml/word16du" xmlns:w16sdtdh="http://schemas.microsoft.com/office/word/2020/wordml/sdtdatahash" xmlns:w16sdtfl="http://schemas.microsoft.com/office/word/2024/wordml/sdtformatlock" xmlns:w16se="http://schemas.microsoft.com/office/word/2015/wordml/symex" xmlns:wpg="http://schemas.microsoft.com/office/word/2010/wordprocessingGroup" xmlns:wpi="http://schemas.microsoft.com/office/word/2010/wordprocessingInk" xmlns:wne="http://schemas.microsoft.com/office/word/2006/wordml" xmlns:wps="http://schemas.microsoft.com/office/word/2010/wordprocessingShape" mc:Ignorable="w14 w15 w16se w16cid w16 w16cex w16sdtdh w16sdtfl w16du wp14">
   <w:abstractNum w:abstractNumId="0" w15:restartNumberingAfterBreak="0">
+    <w:nsid w:val="02CD1749"/>
+    <w:multiLevelType w:val="hybridMultilevel"/>
+    <w:tmpl w:val="03FC3FF8"/>
+    <w:lvl w:ilvl="0" w:tplc="042A0013">
+      <w:start w:val="1"/>
+      <w:numFmt w:val="upperRoman"/>
+      <w:lvlText w:val="%1."/>
+      <w:lvlJc w:val="right"/>
+      <w:pPr>
+        <w:ind w:left="1080" w:hanging="360"/>
+      </w:pPr>
+    </w:lvl>
+    <w:lvl w:ilvl="1" w:tplc="042A0019" w:tentative="1">
+      <w:start w:val="1"/>
+      <w:numFmt w:val="lowerLetter"/>
+      <w:lvlText w:val="%2."/>
+      <w:lvlJc w:val="left"/>
+      <w:pPr>
+        <w:ind w:left="1800" w:hanging="360"/>
+      </w:pPr>
+    </w:lvl>
+    <w:lvl w:ilvl="2" w:tplc="042A001B" w:tentative="1">
+      <w:start w:val="1"/>
+      <w:numFmt w:val="lowerRoman"/>
+      <w:lvlText w:val="%3."/>
+      <w:lvlJc w:val="right"/>
+      <w:pPr>
+        <w:ind w:left="2520" w:hanging="180"/>
+      </w:pPr>
+    </w:lvl>
+    <w:lvl w:ilvl="3" w:tplc="042A000F" w:tentative="1">
+      <w:start w:val="1"/>
+      <w:numFmt w:val="decimal"/>
+      <w:lvlText w:val="%4."/>
+      <w:lvlJc w:val="left"/>
+      <w:pPr>
+        <w:ind w:left="3240" w:hanging="360"/>
+      </w:pPr>
+    </w:lvl>
+    <w:lvl w:ilvl="4" w:tplc="042A0019" w:tentative="1">
+      <w:start w:val="1"/>
+      <w:numFmt w:val="lowerLetter"/>
+      <w:lvlText w:val="%5."/>
+      <w:lvlJc w:val="left"/>
+      <w:pPr>
+        <w:ind w:left="3960" w:hanging="360"/>
+      </w:pPr>
+    </w:lvl>
+    <w:lvl w:ilvl="5" w:tplc="042A001B" w:tentative="1">
+      <w:start w:val="1"/>
+      <w:numFmt w:val="lowerRoman"/>
+      <w:lvlText w:val="%6."/>
+      <w:lvlJc w:val="right"/>
+      <w:pPr>
+        <w:ind w:left="4680" w:hanging="180"/>
+      </w:pPr>
+    </w:lvl>
+    <w:lvl w:ilvl="6" w:tplc="042A000F" w:tentative="1">
+      <w:start w:val="1"/>
+      <w:numFmt w:val="decimal"/>
+      <w:lvlText w:val="%7."/>
+      <w:lvlJc w:val="left"/>
+      <w:pPr>
+        <w:ind w:left="5400" w:hanging="360"/>
+      </w:pPr>
+    </w:lvl>
+    <w:lvl w:ilvl="7" w:tplc="042A0019" w:tentative="1">
+      <w:start w:val="1"/>
+      <w:numFmt w:val="lowerLetter"/>
+      <w:lvlText w:val="%8."/>
+      <w:lvlJc w:val="left"/>
+      <w:pPr>
+        <w:ind w:left="6120" w:hanging="360"/>
+      </w:pPr>
+    </w:lvl>
+    <w:lvl w:ilvl="8" w:tplc="042A001B" w:tentative="1">
+      <w:start w:val="1"/>
+      <w:numFmt w:val="lowerRoman"/>
+      <w:lvlText w:val="%9."/>
+      <w:lvlJc w:val="right"/>
+      <w:pPr>
+        <w:ind w:left="6840" w:hanging="180"/>
+      </w:pPr>
+    </w:lvl>
+  </w:abstractNum>
+  <w:abstractNum w:abstractNumId="1" w15:restartNumberingAfterBreak="0">
     <w:nsid w:val="084C0766"/>
     <w:multiLevelType w:val="multilevel"/>
     <w:tmpl w:val="57FCD41C"/>
@@ -1537,7 +3673,411 @@
       </w:rPr>
     </w:lvl>
   </w:abstractNum>
-  <w:abstractNum w:abstractNumId="1" w15:restartNumberingAfterBreak="0">
+  <w:abstractNum w:abstractNumId="2" w15:restartNumberingAfterBreak="0">
+    <w:nsid w:val="0B7D743B"/>
+    <w:multiLevelType w:val="hybridMultilevel"/>
+    <w:tmpl w:val="5EF431EC"/>
+    <w:lvl w:ilvl="0" w:tplc="10F27740">
+      <w:start w:val="1"/>
+      <w:numFmt w:val="decimal"/>
+      <w:lvlText w:val="%1"/>
+      <w:lvlJc w:val="left"/>
+      <w:pPr>
+        <w:ind w:left="1440" w:hanging="720"/>
+      </w:pPr>
+      <w:rPr>
+        <w:rFonts w:hint="default"/>
+      </w:rPr>
+    </w:lvl>
+    <w:lvl w:ilvl="1" w:tplc="042A0019" w:tentative="1">
+      <w:start w:val="1"/>
+      <w:numFmt w:val="lowerLetter"/>
+      <w:lvlText w:val="%2."/>
+      <w:lvlJc w:val="left"/>
+      <w:pPr>
+        <w:ind w:left="1800" w:hanging="360"/>
+      </w:pPr>
+    </w:lvl>
+    <w:lvl w:ilvl="2" w:tplc="042A001B" w:tentative="1">
+      <w:start w:val="1"/>
+      <w:numFmt w:val="lowerRoman"/>
+      <w:lvlText w:val="%3."/>
+      <w:lvlJc w:val="right"/>
+      <w:pPr>
+        <w:ind w:left="2520" w:hanging="180"/>
+      </w:pPr>
+    </w:lvl>
+    <w:lvl w:ilvl="3" w:tplc="042A000F" w:tentative="1">
+      <w:start w:val="1"/>
+      <w:numFmt w:val="decimal"/>
+      <w:lvlText w:val="%4."/>
+      <w:lvlJc w:val="left"/>
+      <w:pPr>
+        <w:ind w:left="3240" w:hanging="360"/>
+      </w:pPr>
+    </w:lvl>
+    <w:lvl w:ilvl="4" w:tplc="042A0019" w:tentative="1">
+      <w:start w:val="1"/>
+      <w:numFmt w:val="lowerLetter"/>
+      <w:lvlText w:val="%5."/>
+      <w:lvlJc w:val="left"/>
+      <w:pPr>
+        <w:ind w:left="3960" w:hanging="360"/>
+      </w:pPr>
+    </w:lvl>
+    <w:lvl w:ilvl="5" w:tplc="042A001B" w:tentative="1">
+      <w:start w:val="1"/>
+      <w:numFmt w:val="lowerRoman"/>
+      <w:lvlText w:val="%6."/>
+      <w:lvlJc w:val="right"/>
+      <w:pPr>
+        <w:ind w:left="4680" w:hanging="180"/>
+      </w:pPr>
+    </w:lvl>
+    <w:lvl w:ilvl="6" w:tplc="042A000F" w:tentative="1">
+      <w:start w:val="1"/>
+      <w:numFmt w:val="decimal"/>
+      <w:lvlText w:val="%7."/>
+      <w:lvlJc w:val="left"/>
+      <w:pPr>
+        <w:ind w:left="5400" w:hanging="360"/>
+      </w:pPr>
+    </w:lvl>
+    <w:lvl w:ilvl="7" w:tplc="042A0019" w:tentative="1">
+      <w:start w:val="1"/>
+      <w:numFmt w:val="lowerLetter"/>
+      <w:lvlText w:val="%8."/>
+      <w:lvlJc w:val="left"/>
+      <w:pPr>
+        <w:ind w:left="6120" w:hanging="360"/>
+      </w:pPr>
+    </w:lvl>
+    <w:lvl w:ilvl="8" w:tplc="042A001B" w:tentative="1">
+      <w:start w:val="1"/>
+      <w:numFmt w:val="lowerRoman"/>
+      <w:lvlText w:val="%9."/>
+      <w:lvlJc w:val="right"/>
+      <w:pPr>
+        <w:ind w:left="6840" w:hanging="180"/>
+      </w:pPr>
+    </w:lvl>
+  </w:abstractNum>
+  <w:abstractNum w:abstractNumId="3" w15:restartNumberingAfterBreak="0">
+    <w:nsid w:val="10B17DDC"/>
+    <w:multiLevelType w:val="hybridMultilevel"/>
+    <w:tmpl w:val="4C68B0D2"/>
+    <w:lvl w:ilvl="0" w:tplc="042A0013">
+      <w:start w:val="1"/>
+      <w:numFmt w:val="upperRoman"/>
+      <w:lvlText w:val="%1."/>
+      <w:lvlJc w:val="right"/>
+      <w:pPr>
+        <w:ind w:left="720" w:hanging="360"/>
+      </w:pPr>
+    </w:lvl>
+    <w:lvl w:ilvl="1" w:tplc="042A0019" w:tentative="1">
+      <w:start w:val="1"/>
+      <w:numFmt w:val="lowerLetter"/>
+      <w:lvlText w:val="%2."/>
+      <w:lvlJc w:val="left"/>
+      <w:pPr>
+        <w:ind w:left="1440" w:hanging="360"/>
+      </w:pPr>
+    </w:lvl>
+    <w:lvl w:ilvl="2" w:tplc="042A001B" w:tentative="1">
+      <w:start w:val="1"/>
+      <w:numFmt w:val="lowerRoman"/>
+      <w:lvlText w:val="%3."/>
+      <w:lvlJc w:val="right"/>
+      <w:pPr>
+        <w:ind w:left="2160" w:hanging="180"/>
+      </w:pPr>
+    </w:lvl>
+    <w:lvl w:ilvl="3" w:tplc="042A000F" w:tentative="1">
+      <w:start w:val="1"/>
+      <w:numFmt w:val="decimal"/>
+      <w:lvlText w:val="%4."/>
+      <w:lvlJc w:val="left"/>
+      <w:pPr>
+        <w:ind w:left="2880" w:hanging="360"/>
+      </w:pPr>
+    </w:lvl>
+    <w:lvl w:ilvl="4" w:tplc="042A0019" w:tentative="1">
+      <w:start w:val="1"/>
+      <w:numFmt w:val="lowerLetter"/>
+      <w:lvlText w:val="%5."/>
+      <w:lvlJc w:val="left"/>
+      <w:pPr>
+        <w:ind w:left="3600" w:hanging="360"/>
+      </w:pPr>
+    </w:lvl>
+    <w:lvl w:ilvl="5" w:tplc="042A001B" w:tentative="1">
+      <w:start w:val="1"/>
+      <w:numFmt w:val="lowerRoman"/>
+      <w:lvlText w:val="%6."/>
+      <w:lvlJc w:val="right"/>
+      <w:pPr>
+        <w:ind w:left="4320" w:hanging="180"/>
+      </w:pPr>
+    </w:lvl>
+    <w:lvl w:ilvl="6" w:tplc="042A000F" w:tentative="1">
+      <w:start w:val="1"/>
+      <w:numFmt w:val="decimal"/>
+      <w:lvlText w:val="%7."/>
+      <w:lvlJc w:val="left"/>
+      <w:pPr>
+        <w:ind w:left="5040" w:hanging="360"/>
+      </w:pPr>
+    </w:lvl>
+    <w:lvl w:ilvl="7" w:tplc="042A0019" w:tentative="1">
+      <w:start w:val="1"/>
+      <w:numFmt w:val="lowerLetter"/>
+      <w:lvlText w:val="%8."/>
+      <w:lvlJc w:val="left"/>
+      <w:pPr>
+        <w:ind w:left="5760" w:hanging="360"/>
+      </w:pPr>
+    </w:lvl>
+    <w:lvl w:ilvl="8" w:tplc="042A001B" w:tentative="1">
+      <w:start w:val="1"/>
+      <w:numFmt w:val="lowerRoman"/>
+      <w:lvlText w:val="%9."/>
+      <w:lvlJc w:val="right"/>
+      <w:pPr>
+        <w:ind w:left="6480" w:hanging="180"/>
+      </w:pPr>
+    </w:lvl>
+  </w:abstractNum>
+  <w:abstractNum w:abstractNumId="4" w15:restartNumberingAfterBreak="0">
+    <w:nsid w:val="139E4521"/>
+    <w:multiLevelType w:val="hybridMultilevel"/>
+    <w:tmpl w:val="16C4C76C"/>
+    <w:lvl w:ilvl="0" w:tplc="30547F44">
+      <w:start w:val="2"/>
+      <w:numFmt w:val="upperRoman"/>
+      <w:lvlText w:val="%1."/>
+      <w:lvlJc w:val="right"/>
+      <w:pPr>
+        <w:ind w:left="720" w:hanging="360"/>
+      </w:pPr>
+      <w:rPr>
+        <w:rFonts w:hint="default"/>
+      </w:rPr>
+    </w:lvl>
+    <w:lvl w:ilvl="1" w:tplc="042A0019" w:tentative="1">
+      <w:start w:val="1"/>
+      <w:numFmt w:val="lowerLetter"/>
+      <w:lvlText w:val="%2."/>
+      <w:lvlJc w:val="left"/>
+      <w:pPr>
+        <w:ind w:left="1440" w:hanging="360"/>
+      </w:pPr>
+    </w:lvl>
+    <w:lvl w:ilvl="2" w:tplc="042A001B" w:tentative="1">
+      <w:start w:val="1"/>
+      <w:numFmt w:val="lowerRoman"/>
+      <w:lvlText w:val="%3."/>
+      <w:lvlJc w:val="right"/>
+      <w:pPr>
+        <w:ind w:left="2160" w:hanging="180"/>
+      </w:pPr>
+    </w:lvl>
+    <w:lvl w:ilvl="3" w:tplc="042A000F" w:tentative="1">
+      <w:start w:val="1"/>
+      <w:numFmt w:val="decimal"/>
+      <w:lvlText w:val="%4."/>
+      <w:lvlJc w:val="left"/>
+      <w:pPr>
+        <w:ind w:left="2880" w:hanging="360"/>
+      </w:pPr>
+    </w:lvl>
+    <w:lvl w:ilvl="4" w:tplc="042A0019" w:tentative="1">
+      <w:start w:val="1"/>
+      <w:numFmt w:val="lowerLetter"/>
+      <w:lvlText w:val="%5."/>
+      <w:lvlJc w:val="left"/>
+      <w:pPr>
+        <w:ind w:left="3600" w:hanging="360"/>
+      </w:pPr>
+    </w:lvl>
+    <w:lvl w:ilvl="5" w:tplc="042A001B" w:tentative="1">
+      <w:start w:val="1"/>
+      <w:numFmt w:val="lowerRoman"/>
+      <w:lvlText w:val="%6."/>
+      <w:lvlJc w:val="right"/>
+      <w:pPr>
+        <w:ind w:left="4320" w:hanging="180"/>
+      </w:pPr>
+    </w:lvl>
+    <w:lvl w:ilvl="6" w:tplc="042A000F" w:tentative="1">
+      <w:start w:val="1"/>
+      <w:numFmt w:val="decimal"/>
+      <w:lvlText w:val="%7."/>
+      <w:lvlJc w:val="left"/>
+      <w:pPr>
+        <w:ind w:left="5040" w:hanging="360"/>
+      </w:pPr>
+    </w:lvl>
+    <w:lvl w:ilvl="7" w:tplc="042A0019" w:tentative="1">
+      <w:start w:val="1"/>
+      <w:numFmt w:val="lowerLetter"/>
+      <w:lvlText w:val="%8."/>
+      <w:lvlJc w:val="left"/>
+      <w:pPr>
+        <w:ind w:left="5760" w:hanging="360"/>
+      </w:pPr>
+    </w:lvl>
+    <w:lvl w:ilvl="8" w:tplc="042A001B" w:tentative="1">
+      <w:start w:val="1"/>
+      <w:numFmt w:val="lowerRoman"/>
+      <w:lvlText w:val="%9."/>
+      <w:lvlJc w:val="right"/>
+      <w:pPr>
+        <w:ind w:left="6480" w:hanging="180"/>
+      </w:pPr>
+    </w:lvl>
+  </w:abstractNum>
+  <w:abstractNum w:abstractNumId="5" w15:restartNumberingAfterBreak="0">
+    <w:nsid w:val="28527C7D"/>
+    <w:multiLevelType w:val="multilevel"/>
+    <w:tmpl w:val="3764471A"/>
+    <w:lvl w:ilvl="0">
+      <w:start w:val="1"/>
+      <w:numFmt w:val="decimal"/>
+      <w:lvlText w:val="%1."/>
+      <w:lvlJc w:val="left"/>
+      <w:pPr>
+        <w:tabs>
+          <w:tab w:val="num" w:pos="720"/>
+        </w:tabs>
+        <w:ind w:left="720" w:hanging="720"/>
+      </w:pPr>
+      <w:rPr>
+        <w:rFonts w:hint="default"/>
+      </w:rPr>
+    </w:lvl>
+    <w:lvl w:ilvl="1">
+      <w:start w:val="1"/>
+      <w:numFmt w:val="decimal"/>
+      <w:lvlText w:val="%2."/>
+      <w:lvlJc w:val="left"/>
+      <w:pPr>
+        <w:tabs>
+          <w:tab w:val="num" w:pos="1440"/>
+        </w:tabs>
+        <w:ind w:left="1440" w:hanging="720"/>
+      </w:pPr>
+      <w:rPr>
+        <w:rFonts w:hint="default"/>
+      </w:rPr>
+    </w:lvl>
+    <w:lvl w:ilvl="2">
+      <w:start w:val="1"/>
+      <w:numFmt w:val="decimal"/>
+      <w:lvlText w:val="%3."/>
+      <w:lvlJc w:val="left"/>
+      <w:pPr>
+        <w:tabs>
+          <w:tab w:val="num" w:pos="2160"/>
+        </w:tabs>
+        <w:ind w:left="2160" w:hanging="720"/>
+      </w:pPr>
+      <w:rPr>
+        <w:rFonts w:hint="default"/>
+      </w:rPr>
+    </w:lvl>
+    <w:lvl w:ilvl="3">
+      <w:start w:val="1"/>
+      <w:numFmt w:val="decimal"/>
+      <w:lvlText w:val="%4."/>
+      <w:lvlJc w:val="left"/>
+      <w:pPr>
+        <w:tabs>
+          <w:tab w:val="num" w:pos="2880"/>
+        </w:tabs>
+        <w:ind w:left="2880" w:hanging="720"/>
+      </w:pPr>
+      <w:rPr>
+        <w:rFonts w:hint="default"/>
+      </w:rPr>
+    </w:lvl>
+    <w:lvl w:ilvl="4">
+      <w:start w:val="1"/>
+      <w:numFmt w:val="decimal"/>
+      <w:lvlText w:val="%5."/>
+      <w:lvlJc w:val="left"/>
+      <w:pPr>
+        <w:tabs>
+          <w:tab w:val="num" w:pos="3600"/>
+        </w:tabs>
+        <w:ind w:left="3600" w:hanging="720"/>
+      </w:pPr>
+      <w:rPr>
+        <w:rFonts w:hint="default"/>
+      </w:rPr>
+    </w:lvl>
+    <w:lvl w:ilvl="5">
+      <w:start w:val="1"/>
+      <w:numFmt w:val="decimal"/>
+      <w:lvlText w:val="%6."/>
+      <w:lvlJc w:val="left"/>
+      <w:pPr>
+        <w:tabs>
+          <w:tab w:val="num" w:pos="4320"/>
+        </w:tabs>
+        <w:ind w:left="4320" w:hanging="720"/>
+      </w:pPr>
+      <w:rPr>
+        <w:rFonts w:hint="default"/>
+      </w:rPr>
+    </w:lvl>
+    <w:lvl w:ilvl="6">
+      <w:start w:val="1"/>
+      <w:numFmt w:val="decimal"/>
+      <w:lvlText w:val="%7."/>
+      <w:lvlJc w:val="left"/>
+      <w:pPr>
+        <w:tabs>
+          <w:tab w:val="num" w:pos="5040"/>
+        </w:tabs>
+        <w:ind w:left="5040" w:hanging="720"/>
+      </w:pPr>
+      <w:rPr>
+        <w:rFonts w:hint="default"/>
+      </w:rPr>
+    </w:lvl>
+    <w:lvl w:ilvl="7">
+      <w:start w:val="1"/>
+      <w:numFmt w:val="decimal"/>
+      <w:lvlText w:val="%8."/>
+      <w:lvlJc w:val="left"/>
+      <w:pPr>
+        <w:tabs>
+          <w:tab w:val="num" w:pos="5760"/>
+        </w:tabs>
+        <w:ind w:left="5760" w:hanging="720"/>
+      </w:pPr>
+      <w:rPr>
+        <w:rFonts w:hint="default"/>
+      </w:rPr>
+    </w:lvl>
+    <w:lvl w:ilvl="8">
+      <w:start w:val="1"/>
+      <w:numFmt w:val="decimal"/>
+      <w:lvlText w:val="%9."/>
+      <w:lvlJc w:val="left"/>
+      <w:pPr>
+        <w:tabs>
+          <w:tab w:val="num" w:pos="6480"/>
+        </w:tabs>
+        <w:ind w:left="6480" w:hanging="720"/>
+      </w:pPr>
+      <w:rPr>
+        <w:rFonts w:hint="default"/>
+      </w:rPr>
+    </w:lvl>
+  </w:abstractNum>
+  <w:abstractNum w:abstractNumId="6" w15:restartNumberingAfterBreak="0">
     <w:nsid w:val="2ACA3EF1"/>
     <w:multiLevelType w:val="hybridMultilevel"/>
     <w:tmpl w:val="661A5F58"/>
@@ -1623,7 +4163,7 @@
       </w:pPr>
     </w:lvl>
   </w:abstractNum>
-  <w:abstractNum w:abstractNumId="2" w15:restartNumberingAfterBreak="0">
+  <w:abstractNum w:abstractNumId="7" w15:restartNumberingAfterBreak="0">
     <w:nsid w:val="39D90981"/>
     <w:multiLevelType w:val="hybridMultilevel"/>
     <w:tmpl w:val="88EE82DC"/>
@@ -1712,7 +4252,7 @@
       </w:pPr>
     </w:lvl>
   </w:abstractNum>
-  <w:abstractNum w:abstractNumId="3" w15:restartNumberingAfterBreak="0">
+  <w:abstractNum w:abstractNumId="8" w15:restartNumberingAfterBreak="0">
     <w:nsid w:val="3A3B1D38"/>
     <w:multiLevelType w:val="multilevel"/>
     <w:tmpl w:val="24F04D5A"/>
@@ -1861,7 +4401,319 @@
       </w:rPr>
     </w:lvl>
   </w:abstractNum>
-  <w:abstractNum w:abstractNumId="4" w15:restartNumberingAfterBreak="0">
+  <w:abstractNum w:abstractNumId="9" w15:restartNumberingAfterBreak="0">
+    <w:nsid w:val="3E5F0893"/>
+    <w:multiLevelType w:val="hybridMultilevel"/>
+    <w:tmpl w:val="51F2119E"/>
+    <w:lvl w:ilvl="0" w:tplc="042A000F">
+      <w:start w:val="1"/>
+      <w:numFmt w:val="decimal"/>
+      <w:lvlText w:val="%1."/>
+      <w:lvlJc w:val="left"/>
+      <w:pPr>
+        <w:ind w:left="1080" w:hanging="360"/>
+      </w:pPr>
+    </w:lvl>
+    <w:lvl w:ilvl="1" w:tplc="042A0019" w:tentative="1">
+      <w:start w:val="1"/>
+      <w:numFmt w:val="lowerLetter"/>
+      <w:lvlText w:val="%2."/>
+      <w:lvlJc w:val="left"/>
+      <w:pPr>
+        <w:ind w:left="1800" w:hanging="360"/>
+      </w:pPr>
+    </w:lvl>
+    <w:lvl w:ilvl="2" w:tplc="042A001B" w:tentative="1">
+      <w:start w:val="1"/>
+      <w:numFmt w:val="lowerRoman"/>
+      <w:lvlText w:val="%3."/>
+      <w:lvlJc w:val="right"/>
+      <w:pPr>
+        <w:ind w:left="2520" w:hanging="180"/>
+      </w:pPr>
+    </w:lvl>
+    <w:lvl w:ilvl="3" w:tplc="042A000F" w:tentative="1">
+      <w:start w:val="1"/>
+      <w:numFmt w:val="decimal"/>
+      <w:lvlText w:val="%4."/>
+      <w:lvlJc w:val="left"/>
+      <w:pPr>
+        <w:ind w:left="3240" w:hanging="360"/>
+      </w:pPr>
+    </w:lvl>
+    <w:lvl w:ilvl="4" w:tplc="042A0019" w:tentative="1">
+      <w:start w:val="1"/>
+      <w:numFmt w:val="lowerLetter"/>
+      <w:lvlText w:val="%5."/>
+      <w:lvlJc w:val="left"/>
+      <w:pPr>
+        <w:ind w:left="3960" w:hanging="360"/>
+      </w:pPr>
+    </w:lvl>
+    <w:lvl w:ilvl="5" w:tplc="042A001B" w:tentative="1">
+      <w:start w:val="1"/>
+      <w:numFmt w:val="lowerRoman"/>
+      <w:lvlText w:val="%6."/>
+      <w:lvlJc w:val="right"/>
+      <w:pPr>
+        <w:ind w:left="4680" w:hanging="180"/>
+      </w:pPr>
+    </w:lvl>
+    <w:lvl w:ilvl="6" w:tplc="042A000F" w:tentative="1">
+      <w:start w:val="1"/>
+      <w:numFmt w:val="decimal"/>
+      <w:lvlText w:val="%7."/>
+      <w:lvlJc w:val="left"/>
+      <w:pPr>
+        <w:ind w:left="5400" w:hanging="360"/>
+      </w:pPr>
+    </w:lvl>
+    <w:lvl w:ilvl="7" w:tplc="042A0019" w:tentative="1">
+      <w:start w:val="1"/>
+      <w:numFmt w:val="lowerLetter"/>
+      <w:lvlText w:val="%8."/>
+      <w:lvlJc w:val="left"/>
+      <w:pPr>
+        <w:ind w:left="6120" w:hanging="360"/>
+      </w:pPr>
+    </w:lvl>
+    <w:lvl w:ilvl="8" w:tplc="042A001B" w:tentative="1">
+      <w:start w:val="1"/>
+      <w:numFmt w:val="lowerRoman"/>
+      <w:lvlText w:val="%9."/>
+      <w:lvlJc w:val="right"/>
+      <w:pPr>
+        <w:ind w:left="6840" w:hanging="180"/>
+      </w:pPr>
+    </w:lvl>
+  </w:abstractNum>
+  <w:abstractNum w:abstractNumId="10" w15:restartNumberingAfterBreak="0">
+    <w:nsid w:val="43BB179D"/>
+    <w:multiLevelType w:val="hybridMultilevel"/>
+    <w:tmpl w:val="37C27AAE"/>
+    <w:lvl w:ilvl="0" w:tplc="042A000F">
+      <w:start w:val="1"/>
+      <w:numFmt w:val="decimal"/>
+      <w:lvlText w:val="%1."/>
+      <w:lvlJc w:val="left"/>
+      <w:pPr>
+        <w:ind w:left="720" w:hanging="360"/>
+      </w:pPr>
+    </w:lvl>
+    <w:lvl w:ilvl="1" w:tplc="042A0019" w:tentative="1">
+      <w:start w:val="1"/>
+      <w:numFmt w:val="lowerLetter"/>
+      <w:lvlText w:val="%2."/>
+      <w:lvlJc w:val="left"/>
+      <w:pPr>
+        <w:ind w:left="1440" w:hanging="360"/>
+      </w:pPr>
+    </w:lvl>
+    <w:lvl w:ilvl="2" w:tplc="042A001B" w:tentative="1">
+      <w:start w:val="1"/>
+      <w:numFmt w:val="lowerRoman"/>
+      <w:lvlText w:val="%3."/>
+      <w:lvlJc w:val="right"/>
+      <w:pPr>
+        <w:ind w:left="2160" w:hanging="180"/>
+      </w:pPr>
+    </w:lvl>
+    <w:lvl w:ilvl="3" w:tplc="042A000F" w:tentative="1">
+      <w:start w:val="1"/>
+      <w:numFmt w:val="decimal"/>
+      <w:lvlText w:val="%4."/>
+      <w:lvlJc w:val="left"/>
+      <w:pPr>
+        <w:ind w:left="2880" w:hanging="360"/>
+      </w:pPr>
+    </w:lvl>
+    <w:lvl w:ilvl="4" w:tplc="042A0019" w:tentative="1">
+      <w:start w:val="1"/>
+      <w:numFmt w:val="lowerLetter"/>
+      <w:lvlText w:val="%5."/>
+      <w:lvlJc w:val="left"/>
+      <w:pPr>
+        <w:ind w:left="3600" w:hanging="360"/>
+      </w:pPr>
+    </w:lvl>
+    <w:lvl w:ilvl="5" w:tplc="042A001B" w:tentative="1">
+      <w:start w:val="1"/>
+      <w:numFmt w:val="lowerRoman"/>
+      <w:lvlText w:val="%6."/>
+      <w:lvlJc w:val="right"/>
+      <w:pPr>
+        <w:ind w:left="4320" w:hanging="180"/>
+      </w:pPr>
+    </w:lvl>
+    <w:lvl w:ilvl="6" w:tplc="042A000F" w:tentative="1">
+      <w:start w:val="1"/>
+      <w:numFmt w:val="decimal"/>
+      <w:lvlText w:val="%7."/>
+      <w:lvlJc w:val="left"/>
+      <w:pPr>
+        <w:ind w:left="5040" w:hanging="360"/>
+      </w:pPr>
+    </w:lvl>
+    <w:lvl w:ilvl="7" w:tplc="042A0019" w:tentative="1">
+      <w:start w:val="1"/>
+      <w:numFmt w:val="lowerLetter"/>
+      <w:lvlText w:val="%8."/>
+      <w:lvlJc w:val="left"/>
+      <w:pPr>
+        <w:ind w:left="5760" w:hanging="360"/>
+      </w:pPr>
+    </w:lvl>
+    <w:lvl w:ilvl="8" w:tplc="042A001B" w:tentative="1">
+      <w:start w:val="1"/>
+      <w:numFmt w:val="lowerRoman"/>
+      <w:lvlText w:val="%9."/>
+      <w:lvlJc w:val="right"/>
+      <w:pPr>
+        <w:ind w:left="6480" w:hanging="180"/>
+      </w:pPr>
+    </w:lvl>
+  </w:abstractNum>
+  <w:abstractNum w:abstractNumId="11" w15:restartNumberingAfterBreak="0">
+    <w:nsid w:val="45807DCF"/>
+    <w:multiLevelType w:val="multilevel"/>
+    <w:tmpl w:val="1DC2DC5C"/>
+    <w:lvl w:ilvl="0">
+      <w:start w:val="1"/>
+      <w:numFmt w:val="decimal"/>
+      <w:lvlText w:val="%1."/>
+      <w:lvlJc w:val="left"/>
+      <w:pPr>
+        <w:tabs>
+          <w:tab w:val="num" w:pos="720"/>
+        </w:tabs>
+        <w:ind w:left="720" w:hanging="720"/>
+      </w:pPr>
+      <w:rPr>
+        <w:rFonts w:hint="default"/>
+      </w:rPr>
+    </w:lvl>
+    <w:lvl w:ilvl="1">
+      <w:start w:val="1"/>
+      <w:numFmt w:val="decimal"/>
+      <w:lvlText w:val="%2."/>
+      <w:lvlJc w:val="left"/>
+      <w:pPr>
+        <w:tabs>
+          <w:tab w:val="num" w:pos="1440"/>
+        </w:tabs>
+        <w:ind w:left="1440" w:hanging="720"/>
+      </w:pPr>
+      <w:rPr>
+        <w:rFonts w:hint="default"/>
+      </w:rPr>
+    </w:lvl>
+    <w:lvl w:ilvl="2">
+      <w:start w:val="1"/>
+      <w:numFmt w:val="decimal"/>
+      <w:lvlText w:val="%3."/>
+      <w:lvlJc w:val="left"/>
+      <w:pPr>
+        <w:tabs>
+          <w:tab w:val="num" w:pos="2160"/>
+        </w:tabs>
+        <w:ind w:left="2160" w:hanging="720"/>
+      </w:pPr>
+      <w:rPr>
+        <w:rFonts w:hint="default"/>
+      </w:rPr>
+    </w:lvl>
+    <w:lvl w:ilvl="3">
+      <w:start w:val="1"/>
+      <w:numFmt w:val="decimal"/>
+      <w:lvlText w:val="%4."/>
+      <w:lvlJc w:val="left"/>
+      <w:pPr>
+        <w:tabs>
+          <w:tab w:val="num" w:pos="2880"/>
+        </w:tabs>
+        <w:ind w:left="2880" w:hanging="720"/>
+      </w:pPr>
+      <w:rPr>
+        <w:rFonts w:hint="default"/>
+      </w:rPr>
+    </w:lvl>
+    <w:lvl w:ilvl="4">
+      <w:start w:val="1"/>
+      <w:numFmt w:val="decimal"/>
+      <w:lvlText w:val="%5."/>
+      <w:lvlJc w:val="left"/>
+      <w:pPr>
+        <w:tabs>
+          <w:tab w:val="num" w:pos="3600"/>
+        </w:tabs>
+        <w:ind w:left="3600" w:hanging="720"/>
+      </w:pPr>
+      <w:rPr>
+        <w:rFonts w:hint="default"/>
+      </w:rPr>
+    </w:lvl>
+    <w:lvl w:ilvl="5">
+      <w:start w:val="1"/>
+      <w:numFmt w:val="decimal"/>
+      <w:lvlText w:val="%6."/>
+      <w:lvlJc w:val="left"/>
+      <w:pPr>
+        <w:tabs>
+          <w:tab w:val="num" w:pos="4320"/>
+        </w:tabs>
+        <w:ind w:left="4320" w:hanging="720"/>
+      </w:pPr>
+      <w:rPr>
+        <w:rFonts w:hint="default"/>
+      </w:rPr>
+    </w:lvl>
+    <w:lvl w:ilvl="6">
+      <w:start w:val="1"/>
+      <w:numFmt w:val="decimal"/>
+      <w:lvlText w:val="%7."/>
+      <w:lvlJc w:val="left"/>
+      <w:pPr>
+        <w:tabs>
+          <w:tab w:val="num" w:pos="5040"/>
+        </w:tabs>
+        <w:ind w:left="5040" w:hanging="720"/>
+      </w:pPr>
+      <w:rPr>
+        <w:rFonts w:hint="default"/>
+      </w:rPr>
+    </w:lvl>
+    <w:lvl w:ilvl="7">
+      <w:start w:val="1"/>
+      <w:numFmt w:val="decimal"/>
+      <w:lvlText w:val="%8."/>
+      <w:lvlJc w:val="left"/>
+      <w:pPr>
+        <w:tabs>
+          <w:tab w:val="num" w:pos="5760"/>
+        </w:tabs>
+        <w:ind w:left="5760" w:hanging="720"/>
+      </w:pPr>
+      <w:rPr>
+        <w:rFonts w:hint="default"/>
+      </w:rPr>
+    </w:lvl>
+    <w:lvl w:ilvl="8">
+      <w:start w:val="1"/>
+      <w:numFmt w:val="decimal"/>
+      <w:lvlText w:val="%9."/>
+      <w:lvlJc w:val="left"/>
+      <w:pPr>
+        <w:tabs>
+          <w:tab w:val="num" w:pos="6480"/>
+        </w:tabs>
+        <w:ind w:left="6480" w:hanging="720"/>
+      </w:pPr>
+      <w:rPr>
+        <w:rFonts w:hint="default"/>
+      </w:rPr>
+    </w:lvl>
+  </w:abstractNum>
+  <w:abstractNum w:abstractNumId="12" w15:restartNumberingAfterBreak="0">
     <w:nsid w:val="460C018F"/>
     <w:multiLevelType w:val="multilevel"/>
     <w:tmpl w:val="DA883010"/>
@@ -2010,7 +4862,179 @@
       </w:rPr>
     </w:lvl>
   </w:abstractNum>
-  <w:abstractNum w:abstractNumId="5" w15:restartNumberingAfterBreak="0">
+  <w:abstractNum w:abstractNumId="13" w15:restartNumberingAfterBreak="0">
+    <w:nsid w:val="4A2116A8"/>
+    <w:multiLevelType w:val="hybridMultilevel"/>
+    <w:tmpl w:val="DAC0A4CA"/>
+    <w:lvl w:ilvl="0" w:tplc="042A0013">
+      <w:start w:val="1"/>
+      <w:numFmt w:val="upperRoman"/>
+      <w:lvlText w:val="%1."/>
+      <w:lvlJc w:val="right"/>
+      <w:pPr>
+        <w:ind w:left="720" w:hanging="360"/>
+      </w:pPr>
+    </w:lvl>
+    <w:lvl w:ilvl="1" w:tplc="042A0019" w:tentative="1">
+      <w:start w:val="1"/>
+      <w:numFmt w:val="lowerLetter"/>
+      <w:lvlText w:val="%2."/>
+      <w:lvlJc w:val="left"/>
+      <w:pPr>
+        <w:ind w:left="1440" w:hanging="360"/>
+      </w:pPr>
+    </w:lvl>
+    <w:lvl w:ilvl="2" w:tplc="042A001B" w:tentative="1">
+      <w:start w:val="1"/>
+      <w:numFmt w:val="lowerRoman"/>
+      <w:lvlText w:val="%3."/>
+      <w:lvlJc w:val="right"/>
+      <w:pPr>
+        <w:ind w:left="2160" w:hanging="180"/>
+      </w:pPr>
+    </w:lvl>
+    <w:lvl w:ilvl="3" w:tplc="042A000F" w:tentative="1">
+      <w:start w:val="1"/>
+      <w:numFmt w:val="decimal"/>
+      <w:lvlText w:val="%4."/>
+      <w:lvlJc w:val="left"/>
+      <w:pPr>
+        <w:ind w:left="2880" w:hanging="360"/>
+      </w:pPr>
+    </w:lvl>
+    <w:lvl w:ilvl="4" w:tplc="042A0019" w:tentative="1">
+      <w:start w:val="1"/>
+      <w:numFmt w:val="lowerLetter"/>
+      <w:lvlText w:val="%5."/>
+      <w:lvlJc w:val="left"/>
+      <w:pPr>
+        <w:ind w:left="3600" w:hanging="360"/>
+      </w:pPr>
+    </w:lvl>
+    <w:lvl w:ilvl="5" w:tplc="042A001B" w:tentative="1">
+      <w:start w:val="1"/>
+      <w:numFmt w:val="lowerRoman"/>
+      <w:lvlText w:val="%6."/>
+      <w:lvlJc w:val="right"/>
+      <w:pPr>
+        <w:ind w:left="4320" w:hanging="180"/>
+      </w:pPr>
+    </w:lvl>
+    <w:lvl w:ilvl="6" w:tplc="042A000F" w:tentative="1">
+      <w:start w:val="1"/>
+      <w:numFmt w:val="decimal"/>
+      <w:lvlText w:val="%7."/>
+      <w:lvlJc w:val="left"/>
+      <w:pPr>
+        <w:ind w:left="5040" w:hanging="360"/>
+      </w:pPr>
+    </w:lvl>
+    <w:lvl w:ilvl="7" w:tplc="042A0019" w:tentative="1">
+      <w:start w:val="1"/>
+      <w:numFmt w:val="lowerLetter"/>
+      <w:lvlText w:val="%8."/>
+      <w:lvlJc w:val="left"/>
+      <w:pPr>
+        <w:ind w:left="5760" w:hanging="360"/>
+      </w:pPr>
+    </w:lvl>
+    <w:lvl w:ilvl="8" w:tplc="042A001B" w:tentative="1">
+      <w:start w:val="1"/>
+      <w:numFmt w:val="lowerRoman"/>
+      <w:lvlText w:val="%9."/>
+      <w:lvlJc w:val="right"/>
+      <w:pPr>
+        <w:ind w:left="6480" w:hanging="180"/>
+      </w:pPr>
+    </w:lvl>
+  </w:abstractNum>
+  <w:abstractNum w:abstractNumId="14" w15:restartNumberingAfterBreak="0">
+    <w:nsid w:val="4B955EAB"/>
+    <w:multiLevelType w:val="hybridMultilevel"/>
+    <w:tmpl w:val="4170B68E"/>
+    <w:lvl w:ilvl="0" w:tplc="042A0013">
+      <w:start w:val="1"/>
+      <w:numFmt w:val="upperRoman"/>
+      <w:lvlText w:val="%1."/>
+      <w:lvlJc w:val="right"/>
+      <w:pPr>
+        <w:ind w:left="720" w:hanging="360"/>
+      </w:pPr>
+    </w:lvl>
+    <w:lvl w:ilvl="1" w:tplc="042A0019" w:tentative="1">
+      <w:start w:val="1"/>
+      <w:numFmt w:val="lowerLetter"/>
+      <w:lvlText w:val="%2."/>
+      <w:lvlJc w:val="left"/>
+      <w:pPr>
+        <w:ind w:left="1440" w:hanging="360"/>
+      </w:pPr>
+    </w:lvl>
+    <w:lvl w:ilvl="2" w:tplc="042A001B" w:tentative="1">
+      <w:start w:val="1"/>
+      <w:numFmt w:val="lowerRoman"/>
+      <w:lvlText w:val="%3."/>
+      <w:lvlJc w:val="right"/>
+      <w:pPr>
+        <w:ind w:left="2160" w:hanging="180"/>
+      </w:pPr>
+    </w:lvl>
+    <w:lvl w:ilvl="3" w:tplc="042A000F" w:tentative="1">
+      <w:start w:val="1"/>
+      <w:numFmt w:val="decimal"/>
+      <w:lvlText w:val="%4."/>
+      <w:lvlJc w:val="left"/>
+      <w:pPr>
+        <w:ind w:left="2880" w:hanging="360"/>
+      </w:pPr>
+    </w:lvl>
+    <w:lvl w:ilvl="4" w:tplc="042A0019" w:tentative="1">
+      <w:start w:val="1"/>
+      <w:numFmt w:val="lowerLetter"/>
+      <w:lvlText w:val="%5."/>
+      <w:lvlJc w:val="left"/>
+      <w:pPr>
+        <w:ind w:left="3600" w:hanging="360"/>
+      </w:pPr>
+    </w:lvl>
+    <w:lvl w:ilvl="5" w:tplc="042A001B" w:tentative="1">
+      <w:start w:val="1"/>
+      <w:numFmt w:val="lowerRoman"/>
+      <w:lvlText w:val="%6."/>
+      <w:lvlJc w:val="right"/>
+      <w:pPr>
+        <w:ind w:left="4320" w:hanging="180"/>
+      </w:pPr>
+    </w:lvl>
+    <w:lvl w:ilvl="6" w:tplc="042A000F" w:tentative="1">
+      <w:start w:val="1"/>
+      <w:numFmt w:val="decimal"/>
+      <w:lvlText w:val="%7."/>
+      <w:lvlJc w:val="left"/>
+      <w:pPr>
+        <w:ind w:left="5040" w:hanging="360"/>
+      </w:pPr>
+    </w:lvl>
+    <w:lvl w:ilvl="7" w:tplc="042A0019" w:tentative="1">
+      <w:start w:val="1"/>
+      <w:numFmt w:val="lowerLetter"/>
+      <w:lvlText w:val="%8."/>
+      <w:lvlJc w:val="left"/>
+      <w:pPr>
+        <w:ind w:left="5760" w:hanging="360"/>
+      </w:pPr>
+    </w:lvl>
+    <w:lvl w:ilvl="8" w:tplc="042A001B" w:tentative="1">
+      <w:start w:val="1"/>
+      <w:numFmt w:val="lowerRoman"/>
+      <w:lvlText w:val="%9."/>
+      <w:lvlJc w:val="right"/>
+      <w:pPr>
+        <w:ind w:left="6480" w:hanging="180"/>
+      </w:pPr>
+    </w:lvl>
+  </w:abstractNum>
+  <w:abstractNum w:abstractNumId="15" w15:restartNumberingAfterBreak="0">
     <w:nsid w:val="51574EB8"/>
     <w:multiLevelType w:val="multilevel"/>
     <w:tmpl w:val="39B05CCE"/>
@@ -2159,7 +5183,93 @@
       </w:rPr>
     </w:lvl>
   </w:abstractNum>
-  <w:abstractNum w:abstractNumId="6" w15:restartNumberingAfterBreak="0">
+  <w:abstractNum w:abstractNumId="16" w15:restartNumberingAfterBreak="0">
+    <w:nsid w:val="51A74CD8"/>
+    <w:multiLevelType w:val="hybridMultilevel"/>
+    <w:tmpl w:val="4742158C"/>
+    <w:lvl w:ilvl="0" w:tplc="042A0013">
+      <w:start w:val="1"/>
+      <w:numFmt w:val="upperRoman"/>
+      <w:lvlText w:val="%1."/>
+      <w:lvlJc w:val="right"/>
+      <w:pPr>
+        <w:ind w:left="720" w:hanging="360"/>
+      </w:pPr>
+    </w:lvl>
+    <w:lvl w:ilvl="1" w:tplc="042A0019" w:tentative="1">
+      <w:start w:val="1"/>
+      <w:numFmt w:val="lowerLetter"/>
+      <w:lvlText w:val="%2."/>
+      <w:lvlJc w:val="left"/>
+      <w:pPr>
+        <w:ind w:left="1440" w:hanging="360"/>
+      </w:pPr>
+    </w:lvl>
+    <w:lvl w:ilvl="2" w:tplc="042A001B" w:tentative="1">
+      <w:start w:val="1"/>
+      <w:numFmt w:val="lowerRoman"/>
+      <w:lvlText w:val="%3."/>
+      <w:lvlJc w:val="right"/>
+      <w:pPr>
+        <w:ind w:left="2160" w:hanging="180"/>
+      </w:pPr>
+    </w:lvl>
+    <w:lvl w:ilvl="3" w:tplc="042A000F" w:tentative="1">
+      <w:start w:val="1"/>
+      <w:numFmt w:val="decimal"/>
+      <w:lvlText w:val="%4."/>
+      <w:lvlJc w:val="left"/>
+      <w:pPr>
+        <w:ind w:left="2880" w:hanging="360"/>
+      </w:pPr>
+    </w:lvl>
+    <w:lvl w:ilvl="4" w:tplc="042A0019" w:tentative="1">
+      <w:start w:val="1"/>
+      <w:numFmt w:val="lowerLetter"/>
+      <w:lvlText w:val="%5."/>
+      <w:lvlJc w:val="left"/>
+      <w:pPr>
+        <w:ind w:left="3600" w:hanging="360"/>
+      </w:pPr>
+    </w:lvl>
+    <w:lvl w:ilvl="5" w:tplc="042A001B" w:tentative="1">
+      <w:start w:val="1"/>
+      <w:numFmt w:val="lowerRoman"/>
+      <w:lvlText w:val="%6."/>
+      <w:lvlJc w:val="right"/>
+      <w:pPr>
+        <w:ind w:left="4320" w:hanging="180"/>
+      </w:pPr>
+    </w:lvl>
+    <w:lvl w:ilvl="6" w:tplc="042A000F" w:tentative="1">
+      <w:start w:val="1"/>
+      <w:numFmt w:val="decimal"/>
+      <w:lvlText w:val="%7."/>
+      <w:lvlJc w:val="left"/>
+      <w:pPr>
+        <w:ind w:left="5040" w:hanging="360"/>
+      </w:pPr>
+    </w:lvl>
+    <w:lvl w:ilvl="7" w:tplc="042A0019" w:tentative="1">
+      <w:start w:val="1"/>
+      <w:numFmt w:val="lowerLetter"/>
+      <w:lvlText w:val="%8."/>
+      <w:lvlJc w:val="left"/>
+      <w:pPr>
+        <w:ind w:left="5760" w:hanging="360"/>
+      </w:pPr>
+    </w:lvl>
+    <w:lvl w:ilvl="8" w:tplc="042A001B" w:tentative="1">
+      <w:start w:val="1"/>
+      <w:numFmt w:val="lowerRoman"/>
+      <w:lvlText w:val="%9."/>
+      <w:lvlJc w:val="right"/>
+      <w:pPr>
+        <w:ind w:left="6480" w:hanging="180"/>
+      </w:pPr>
+    </w:lvl>
+  </w:abstractNum>
+  <w:abstractNum w:abstractNumId="17" w15:restartNumberingAfterBreak="0">
     <w:nsid w:val="522226D5"/>
     <w:multiLevelType w:val="hybridMultilevel"/>
     <w:tmpl w:val="C16251B4"/>
@@ -2272,7 +5382,93 @@
       </w:rPr>
     </w:lvl>
   </w:abstractNum>
-  <w:abstractNum w:abstractNumId="7" w15:restartNumberingAfterBreak="0">
+  <w:abstractNum w:abstractNumId="18" w15:restartNumberingAfterBreak="0">
+    <w:nsid w:val="582B3FC8"/>
+    <w:multiLevelType w:val="hybridMultilevel"/>
+    <w:tmpl w:val="46466C8A"/>
+    <w:lvl w:ilvl="0" w:tplc="042A000F">
+      <w:start w:val="1"/>
+      <w:numFmt w:val="decimal"/>
+      <w:lvlText w:val="%1."/>
+      <w:lvlJc w:val="left"/>
+      <w:pPr>
+        <w:ind w:left="720" w:hanging="360"/>
+      </w:pPr>
+    </w:lvl>
+    <w:lvl w:ilvl="1" w:tplc="042A0019" w:tentative="1">
+      <w:start w:val="1"/>
+      <w:numFmt w:val="lowerLetter"/>
+      <w:lvlText w:val="%2."/>
+      <w:lvlJc w:val="left"/>
+      <w:pPr>
+        <w:ind w:left="1440" w:hanging="360"/>
+      </w:pPr>
+    </w:lvl>
+    <w:lvl w:ilvl="2" w:tplc="042A001B" w:tentative="1">
+      <w:start w:val="1"/>
+      <w:numFmt w:val="lowerRoman"/>
+      <w:lvlText w:val="%3."/>
+      <w:lvlJc w:val="right"/>
+      <w:pPr>
+        <w:ind w:left="2160" w:hanging="180"/>
+      </w:pPr>
+    </w:lvl>
+    <w:lvl w:ilvl="3" w:tplc="042A000F" w:tentative="1">
+      <w:start w:val="1"/>
+      <w:numFmt w:val="decimal"/>
+      <w:lvlText w:val="%4."/>
+      <w:lvlJc w:val="left"/>
+      <w:pPr>
+        <w:ind w:left="2880" w:hanging="360"/>
+      </w:pPr>
+    </w:lvl>
+    <w:lvl w:ilvl="4" w:tplc="042A0019" w:tentative="1">
+      <w:start w:val="1"/>
+      <w:numFmt w:val="lowerLetter"/>
+      <w:lvlText w:val="%5."/>
+      <w:lvlJc w:val="left"/>
+      <w:pPr>
+        <w:ind w:left="3600" w:hanging="360"/>
+      </w:pPr>
+    </w:lvl>
+    <w:lvl w:ilvl="5" w:tplc="042A001B" w:tentative="1">
+      <w:start w:val="1"/>
+      <w:numFmt w:val="lowerRoman"/>
+      <w:lvlText w:val="%6."/>
+      <w:lvlJc w:val="right"/>
+      <w:pPr>
+        <w:ind w:left="4320" w:hanging="180"/>
+      </w:pPr>
+    </w:lvl>
+    <w:lvl w:ilvl="6" w:tplc="042A000F" w:tentative="1">
+      <w:start w:val="1"/>
+      <w:numFmt w:val="decimal"/>
+      <w:lvlText w:val="%7."/>
+      <w:lvlJc w:val="left"/>
+      <w:pPr>
+        <w:ind w:left="5040" w:hanging="360"/>
+      </w:pPr>
+    </w:lvl>
+    <w:lvl w:ilvl="7" w:tplc="042A0019" w:tentative="1">
+      <w:start w:val="1"/>
+      <w:numFmt w:val="lowerLetter"/>
+      <w:lvlText w:val="%8."/>
+      <w:lvlJc w:val="left"/>
+      <w:pPr>
+        <w:ind w:left="5760" w:hanging="360"/>
+      </w:pPr>
+    </w:lvl>
+    <w:lvl w:ilvl="8" w:tplc="042A001B" w:tentative="1">
+      <w:start w:val="1"/>
+      <w:numFmt w:val="lowerRoman"/>
+      <w:lvlText w:val="%9."/>
+      <w:lvlJc w:val="right"/>
+      <w:pPr>
+        <w:ind w:left="6480" w:hanging="180"/>
+      </w:pPr>
+    </w:lvl>
+  </w:abstractNum>
+  <w:abstractNum w:abstractNumId="19" w15:restartNumberingAfterBreak="0">
     <w:nsid w:val="5872625B"/>
     <w:multiLevelType w:val="hybridMultilevel"/>
     <w:tmpl w:val="C3425AE2"/>
@@ -2361,10 +5557,216 @@
       </w:pPr>
     </w:lvl>
   </w:abstractNum>
-  <w:abstractNum w:abstractNumId="8" w15:restartNumberingAfterBreak="0">
+  <w:abstractNum w:abstractNumId="20" w15:restartNumberingAfterBreak="0">
+    <w:nsid w:val="58F279AB"/>
+    <w:multiLevelType w:val="hybridMultilevel"/>
+    <w:tmpl w:val="BA98E2F4"/>
+    <w:lvl w:ilvl="0" w:tplc="1A521B00">
+      <w:start w:val="2"/>
+      <w:numFmt w:val="upperRoman"/>
+      <w:lvlText w:val="%1."/>
+      <w:lvlJc w:val="right"/>
+      <w:pPr>
+        <w:ind w:left="720" w:hanging="360"/>
+      </w:pPr>
+      <w:rPr>
+        <w:rFonts w:hint="default"/>
+      </w:rPr>
+    </w:lvl>
+    <w:lvl w:ilvl="1" w:tplc="042A0019" w:tentative="1">
+      <w:start w:val="1"/>
+      <w:numFmt w:val="lowerLetter"/>
+      <w:lvlText w:val="%2."/>
+      <w:lvlJc w:val="left"/>
+      <w:pPr>
+        <w:ind w:left="1440" w:hanging="360"/>
+      </w:pPr>
+    </w:lvl>
+    <w:lvl w:ilvl="2" w:tplc="042A001B" w:tentative="1">
+      <w:start w:val="1"/>
+      <w:numFmt w:val="lowerRoman"/>
+      <w:lvlText w:val="%3."/>
+      <w:lvlJc w:val="right"/>
+      <w:pPr>
+        <w:ind w:left="2160" w:hanging="180"/>
+      </w:pPr>
+    </w:lvl>
+    <w:lvl w:ilvl="3" w:tplc="042A000F" w:tentative="1">
+      <w:start w:val="1"/>
+      <w:numFmt w:val="decimal"/>
+      <w:lvlText w:val="%4."/>
+      <w:lvlJc w:val="left"/>
+      <w:pPr>
+        <w:ind w:left="2880" w:hanging="360"/>
+      </w:pPr>
+    </w:lvl>
+    <w:lvl w:ilvl="4" w:tplc="042A0019" w:tentative="1">
+      <w:start w:val="1"/>
+      <w:numFmt w:val="lowerLetter"/>
+      <w:lvlText w:val="%5."/>
+      <w:lvlJc w:val="left"/>
+      <w:pPr>
+        <w:ind w:left="3600" w:hanging="360"/>
+      </w:pPr>
+    </w:lvl>
+    <w:lvl w:ilvl="5" w:tplc="042A001B" w:tentative="1">
+      <w:start w:val="1"/>
+      <w:numFmt w:val="lowerRoman"/>
+      <w:lvlText w:val="%6."/>
+      <w:lvlJc w:val="right"/>
+      <w:pPr>
+        <w:ind w:left="4320" w:hanging="180"/>
+      </w:pPr>
+    </w:lvl>
+    <w:lvl w:ilvl="6" w:tplc="042A000F" w:tentative="1">
+      <w:start w:val="1"/>
+      <w:numFmt w:val="decimal"/>
+      <w:lvlText w:val="%7."/>
+      <w:lvlJc w:val="left"/>
+      <w:pPr>
+        <w:ind w:left="5040" w:hanging="360"/>
+      </w:pPr>
+    </w:lvl>
+    <w:lvl w:ilvl="7" w:tplc="042A0019" w:tentative="1">
+      <w:start w:val="1"/>
+      <w:numFmt w:val="lowerLetter"/>
+      <w:lvlText w:val="%8."/>
+      <w:lvlJc w:val="left"/>
+      <w:pPr>
+        <w:ind w:left="5760" w:hanging="360"/>
+      </w:pPr>
+    </w:lvl>
+    <w:lvl w:ilvl="8" w:tplc="042A001B" w:tentative="1">
+      <w:start w:val="1"/>
+      <w:numFmt w:val="lowerRoman"/>
+      <w:lvlText w:val="%9."/>
+      <w:lvlJc w:val="right"/>
+      <w:pPr>
+        <w:ind w:left="6480" w:hanging="180"/>
+      </w:pPr>
+    </w:lvl>
+  </w:abstractNum>
+  <w:abstractNum w:abstractNumId="21" w15:restartNumberingAfterBreak="0">
+    <w:nsid w:val="67CE135E"/>
+    <w:multiLevelType w:val="multilevel"/>
+    <w:tmpl w:val="F4E0BDA0"/>
+    <w:lvl w:ilvl="0">
+      <w:start w:val="1"/>
+      <w:numFmt w:val="upperRoman"/>
+      <w:lvlText w:val="%1."/>
+      <w:lvlJc w:val="right"/>
+      <w:pPr>
+        <w:ind w:left="720" w:hanging="360"/>
+      </w:pPr>
+      <w:rPr>
+        <w:rFonts w:hint="default"/>
+        <w:u w:val="none"/>
+      </w:rPr>
+    </w:lvl>
+    <w:lvl w:ilvl="1">
+      <w:start w:val="1"/>
+      <w:numFmt w:val="upperRoman"/>
+      <w:lvlText w:val="%2."/>
+      <w:lvlJc w:val="right"/>
+      <w:pPr>
+        <w:ind w:left="1440" w:hanging="360"/>
+      </w:pPr>
+    </w:lvl>
+    <w:lvl w:ilvl="2">
+      <w:start w:val="1"/>
+      <w:numFmt w:val="decimal"/>
+      <w:lvlText w:val="1.%3"/>
+      <w:lvlJc w:val="left"/>
+      <w:pPr>
+        <w:ind w:left="2160" w:hanging="360"/>
+      </w:pPr>
+      <w:rPr>
+        <w:rFonts w:hint="default"/>
+      </w:rPr>
+    </w:lvl>
+    <w:lvl w:ilvl="3">
+      <w:start w:val="1"/>
+      <w:numFmt w:val="decimal"/>
+      <w:lvlText w:val="%4."/>
+      <w:lvlJc w:val="left"/>
+      <w:pPr>
+        <w:ind w:left="2880" w:hanging="360"/>
+      </w:pPr>
+      <w:rPr>
+        <w:rFonts w:hint="default"/>
+        <w:u w:val="none"/>
+      </w:rPr>
+    </w:lvl>
+    <w:lvl w:ilvl="4">
+      <w:start w:val="1"/>
+      <w:numFmt w:val="lowerLetter"/>
+      <w:lvlText w:val="%5."/>
+      <w:lvlJc w:val="left"/>
+      <w:pPr>
+        <w:ind w:left="3600" w:hanging="360"/>
+      </w:pPr>
+      <w:rPr>
+        <w:rFonts w:hint="default"/>
+        <w:u w:val="none"/>
+      </w:rPr>
+    </w:lvl>
+    <w:lvl w:ilvl="5">
+      <w:start w:val="1"/>
+      <w:numFmt w:val="lowerRoman"/>
+      <w:lvlText w:val="%6."/>
+      <w:lvlJc w:val="left"/>
+      <w:pPr>
+        <w:ind w:left="4320" w:hanging="360"/>
+      </w:pPr>
+      <w:rPr>
+        <w:rFonts w:hint="default"/>
+        <w:u w:val="none"/>
+      </w:rPr>
+    </w:lvl>
+    <w:lvl w:ilvl="6">
+      <w:start w:val="1"/>
+      <w:numFmt w:val="decimal"/>
+      <w:lvlText w:val="%7."/>
+      <w:lvlJc w:val="left"/>
+      <w:pPr>
+        <w:ind w:left="5040" w:hanging="360"/>
+      </w:pPr>
+      <w:rPr>
+        <w:rFonts w:hint="default"/>
+        <w:u w:val="none"/>
+      </w:rPr>
+    </w:lvl>
+    <w:lvl w:ilvl="7">
+      <w:start w:val="1"/>
+      <w:numFmt w:val="lowerLetter"/>
+      <w:lvlText w:val="%8."/>
+      <w:lvlJc w:val="left"/>
+      <w:pPr>
+        <w:ind w:left="5760" w:hanging="360"/>
+      </w:pPr>
+      <w:rPr>
+        <w:rFonts w:hint="default"/>
+        <w:u w:val="none"/>
+      </w:rPr>
+    </w:lvl>
+    <w:lvl w:ilvl="8">
+      <w:start w:val="1"/>
+      <w:numFmt w:val="lowerRoman"/>
+      <w:lvlText w:val="%9."/>
+      <w:lvlJc w:val="left"/>
+      <w:pPr>
+        <w:ind w:left="6480" w:hanging="360"/>
+      </w:pPr>
+      <w:rPr>
+        <w:rFonts w:hint="default"/>
+        <w:u w:val="none"/>
+      </w:rPr>
+    </w:lvl>
+  </w:abstractNum>
+  <w:abstractNum w:abstractNumId="22" w15:restartNumberingAfterBreak="0">
     <w:nsid w:val="67E175D1"/>
     <w:multiLevelType w:val="multilevel"/>
-    <w:tmpl w:val="253E3F5C"/>
+    <w:tmpl w:val="69A40FD6"/>
     <w:lvl w:ilvl="0">
       <w:start w:val="1"/>
       <w:numFmt w:val="decimal"/>
@@ -2380,7 +5782,6 @@
     <w:lvl w:ilvl="1">
       <w:start w:val="1"/>
       <w:numFmt w:val="decimal"/>
-      <w:pStyle w:val="Heading2"/>
       <w:lvlText w:val="%2."/>
       <w:lvlJc w:val="left"/>
       <w:pPr>
@@ -2475,10 +5876,10 @@
       </w:pPr>
     </w:lvl>
   </w:abstractNum>
-  <w:abstractNum w:abstractNumId="9" w15:restartNumberingAfterBreak="0">
+  <w:abstractNum w:abstractNumId="23" w15:restartNumberingAfterBreak="0">
     <w:nsid w:val="74CA4685"/>
     <w:multiLevelType w:val="multilevel"/>
-    <w:tmpl w:val="735873EA"/>
+    <w:tmpl w:val="AA3AF4CA"/>
     <w:lvl w:ilvl="0">
       <w:start w:val="6"/>
       <w:numFmt w:val="decimal"/>
@@ -2495,15 +5896,12 @@
     </w:lvl>
     <w:lvl w:ilvl="1">
       <w:start w:val="1"/>
-      <w:numFmt w:val="decimal"/>
-      <w:lvlText w:val="%2"/>
-      <w:lvlJc w:val="left"/>
+      <w:numFmt w:val="upperRoman"/>
+      <w:lvlText w:val="%2."/>
+      <w:lvlJc w:val="right"/>
       <w:pPr>
         <w:ind w:left="1440" w:hanging="360"/>
       </w:pPr>
-      <w:rPr>
-        <w:rFonts w:hint="default"/>
-      </w:rPr>
     </w:lvl>
     <w:lvl w:ilvl="2">
       <w:start w:val="1"/>
@@ -2596,37 +5994,199 @@
       </w:rPr>
     </w:lvl>
   </w:abstractNum>
+  <w:abstractNum w:abstractNumId="24" w15:restartNumberingAfterBreak="0">
+    <w:nsid w:val="7B426936"/>
+    <w:multiLevelType w:val="multilevel"/>
+    <w:tmpl w:val="247E7A6C"/>
+    <w:lvl w:ilvl="0">
+      <w:start w:val="1"/>
+      <w:numFmt w:val="upperRoman"/>
+      <w:lvlText w:val="%1."/>
+      <w:lvlJc w:val="right"/>
+      <w:pPr>
+        <w:ind w:left="720" w:hanging="360"/>
+      </w:pPr>
+      <w:rPr>
+        <w:rFonts w:hint="default"/>
+        <w:u w:val="none"/>
+      </w:rPr>
+    </w:lvl>
+    <w:lvl w:ilvl="1">
+      <w:start w:val="1"/>
+      <w:numFmt w:val="upperRoman"/>
+      <w:lvlText w:val="%2."/>
+      <w:lvlJc w:val="right"/>
+      <w:pPr>
+        <w:ind w:left="1440" w:hanging="360"/>
+      </w:pPr>
+    </w:lvl>
+    <w:lvl w:ilvl="2">
+      <w:start w:val="1"/>
+      <w:numFmt w:val="decimal"/>
+      <w:lvlText w:val="1.%3"/>
+      <w:lvlJc w:val="left"/>
+      <w:pPr>
+        <w:ind w:left="2160" w:hanging="360"/>
+      </w:pPr>
+      <w:rPr>
+        <w:rFonts w:hint="default"/>
+      </w:rPr>
+    </w:lvl>
+    <w:lvl w:ilvl="3">
+      <w:start w:val="1"/>
+      <w:numFmt w:val="decimal"/>
+      <w:lvlText w:val="%4."/>
+      <w:lvlJc w:val="left"/>
+      <w:pPr>
+        <w:ind w:left="2880" w:hanging="360"/>
+      </w:pPr>
+      <w:rPr>
+        <w:rFonts w:hint="default"/>
+        <w:u w:val="none"/>
+      </w:rPr>
+    </w:lvl>
+    <w:lvl w:ilvl="4">
+      <w:start w:val="1"/>
+      <w:numFmt w:val="lowerLetter"/>
+      <w:lvlText w:val="%5."/>
+      <w:lvlJc w:val="left"/>
+      <w:pPr>
+        <w:ind w:left="3600" w:hanging="360"/>
+      </w:pPr>
+      <w:rPr>
+        <w:rFonts w:hint="default"/>
+        <w:u w:val="none"/>
+      </w:rPr>
+    </w:lvl>
+    <w:lvl w:ilvl="5">
+      <w:start w:val="1"/>
+      <w:numFmt w:val="lowerRoman"/>
+      <w:lvlText w:val="%6."/>
+      <w:lvlJc w:val="left"/>
+      <w:pPr>
+        <w:ind w:left="4320" w:hanging="360"/>
+      </w:pPr>
+      <w:rPr>
+        <w:rFonts w:hint="default"/>
+        <w:u w:val="none"/>
+      </w:rPr>
+    </w:lvl>
+    <w:lvl w:ilvl="6">
+      <w:start w:val="1"/>
+      <w:numFmt w:val="decimal"/>
+      <w:lvlText w:val="%7."/>
+      <w:lvlJc w:val="left"/>
+      <w:pPr>
+        <w:ind w:left="5040" w:hanging="360"/>
+      </w:pPr>
+      <w:rPr>
+        <w:rFonts w:hint="default"/>
+        <w:u w:val="none"/>
+      </w:rPr>
+    </w:lvl>
+    <w:lvl w:ilvl="7">
+      <w:start w:val="1"/>
+      <w:numFmt w:val="lowerLetter"/>
+      <w:lvlText w:val="%8."/>
+      <w:lvlJc w:val="left"/>
+      <w:pPr>
+        <w:ind w:left="5760" w:hanging="360"/>
+      </w:pPr>
+      <w:rPr>
+        <w:rFonts w:hint="default"/>
+        <w:u w:val="none"/>
+      </w:rPr>
+    </w:lvl>
+    <w:lvl w:ilvl="8">
+      <w:start w:val="1"/>
+      <w:numFmt w:val="lowerRoman"/>
+      <w:lvlText w:val="%9."/>
+      <w:lvlJc w:val="left"/>
+      <w:pPr>
+        <w:ind w:left="6480" w:hanging="360"/>
+      </w:pPr>
+      <w:rPr>
+        <w:rFonts w:hint="default"/>
+        <w:u w:val="none"/>
+      </w:rPr>
+    </w:lvl>
+  </w:abstractNum>
   <w:num w:numId="1" w16cid:durableId="869103678">
+    <w:abstractNumId w:val="23"/>
+  </w:num>
+  <w:num w:numId="2" w16cid:durableId="1451120873">
+    <w:abstractNumId w:val="23"/>
+  </w:num>
+  <w:num w:numId="3" w16cid:durableId="349724275">
+    <w:abstractNumId w:val="22"/>
+  </w:num>
+  <w:num w:numId="4" w16cid:durableId="1734085087">
+    <w:abstractNumId w:val="1"/>
+  </w:num>
+  <w:num w:numId="5" w16cid:durableId="165485598">
+    <w:abstractNumId w:val="19"/>
+  </w:num>
+  <w:num w:numId="6" w16cid:durableId="1342898418">
+    <w:abstractNumId w:val="15"/>
+  </w:num>
+  <w:num w:numId="7" w16cid:durableId="1843008247">
+    <w:abstractNumId w:val="8"/>
+  </w:num>
+  <w:num w:numId="8" w16cid:durableId="84693074">
+    <w:abstractNumId w:val="6"/>
+  </w:num>
+  <w:num w:numId="9" w16cid:durableId="633758116">
+    <w:abstractNumId w:val="12"/>
+  </w:num>
+  <w:num w:numId="10" w16cid:durableId="346491549">
+    <w:abstractNumId w:val="17"/>
+  </w:num>
+  <w:num w:numId="11" w16cid:durableId="395519646">
+    <w:abstractNumId w:val="7"/>
+  </w:num>
+  <w:num w:numId="12" w16cid:durableId="1649094483">
+    <w:abstractNumId w:val="10"/>
+  </w:num>
+  <w:num w:numId="13" w16cid:durableId="1691906457">
+    <w:abstractNumId w:val="16"/>
+  </w:num>
+  <w:num w:numId="14" w16cid:durableId="1634679329">
+    <w:abstractNumId w:val="14"/>
+  </w:num>
+  <w:num w:numId="15" w16cid:durableId="1381980366">
+    <w:abstractNumId w:val="3"/>
+  </w:num>
+  <w:num w:numId="16" w16cid:durableId="1540387502">
+    <w:abstractNumId w:val="13"/>
+  </w:num>
+  <w:num w:numId="17" w16cid:durableId="72508496">
+    <w:abstractNumId w:val="24"/>
+  </w:num>
+  <w:num w:numId="18" w16cid:durableId="787117103">
+    <w:abstractNumId w:val="21"/>
+  </w:num>
+  <w:num w:numId="19" w16cid:durableId="1463188367">
+    <w:abstractNumId w:val="0"/>
+  </w:num>
+  <w:num w:numId="20" w16cid:durableId="220557493">
+    <w:abstractNumId w:val="4"/>
+  </w:num>
+  <w:num w:numId="21" w16cid:durableId="1275481028">
+    <w:abstractNumId w:val="20"/>
+  </w:num>
+  <w:num w:numId="22" w16cid:durableId="1305164922">
+    <w:abstractNumId w:val="18"/>
+  </w:num>
+  <w:num w:numId="23" w16cid:durableId="446579641">
+    <w:abstractNumId w:val="11"/>
+  </w:num>
+  <w:num w:numId="24" w16cid:durableId="452871400">
+    <w:abstractNumId w:val="5"/>
+  </w:num>
+  <w:num w:numId="25" w16cid:durableId="1138453288">
     <w:abstractNumId w:val="9"/>
   </w:num>
-  <w:num w:numId="2" w16cid:durableId="1451120873">
-    <w:abstractNumId w:val="9"/>
-  </w:num>
-  <w:num w:numId="3" w16cid:durableId="349724275">
-    <w:abstractNumId w:val="8"/>
-  </w:num>
-  <w:num w:numId="4" w16cid:durableId="1734085087">
-    <w:abstractNumId w:val="0"/>
-  </w:num>
-  <w:num w:numId="5" w16cid:durableId="165485598">
-    <w:abstractNumId w:val="7"/>
-  </w:num>
-  <w:num w:numId="6" w16cid:durableId="1342898418">
-    <w:abstractNumId w:val="5"/>
-  </w:num>
-  <w:num w:numId="7" w16cid:durableId="1843008247">
-    <w:abstractNumId w:val="3"/>
-  </w:num>
-  <w:num w:numId="8" w16cid:durableId="84693074">
-    <w:abstractNumId w:val="1"/>
-  </w:num>
-  <w:num w:numId="9" w16cid:durableId="633758116">
-    <w:abstractNumId w:val="4"/>
-  </w:num>
-  <w:num w:numId="10" w16cid:durableId="346491549">
-    <w:abstractNumId w:val="6"/>
-  </w:num>
-  <w:num w:numId="11" w16cid:durableId="395519646">
+  <w:num w:numId="26" w16cid:durableId="1087389746">
     <w:abstractNumId w:val="2"/>
   </w:num>
 </w:numbering>
@@ -3066,17 +6626,17 @@
     <w:uiPriority w:val="9"/>
     <w:unhideWhenUsed/>
     <w:qFormat/>
-    <w:rsid w:val="00FA6F97"/>
+    <w:rsid w:val="00E1051C"/>
     <w:pPr>
       <w:numPr>
-        <w:ilvl w:val="1"/>
-        <w:numId w:val="3"/>
+        <w:numId w:val="0"/>
       </w:numPr>
-      <w:ind w:left="1080"/>
+      <w:ind w:left="360"/>
       <w:outlineLvl w:val="1"/>
     </w:pPr>
     <w:rPr>
       <w:sz w:val="28"/>
+      <w:lang w:val="en-US"/>
     </w:rPr>
   </w:style>
   <w:style w:type="paragraph" w:styleId="Heading3">
@@ -3278,12 +6838,13 @@
     <w:basedOn w:val="DefaultParagraphFont"/>
     <w:link w:val="Heading2"/>
     <w:uiPriority w:val="9"/>
-    <w:rsid w:val="00FA6F97"/>
+    <w:rsid w:val="00E1051C"/>
     <w:rPr>
       <w:rFonts w:ascii="Times New Roman" w:eastAsia="Times New Roman" w:hAnsi="Times New Roman" w:cs="Times New Roman"/>
       <w:b/>
       <w:sz w:val="28"/>
       <w:szCs w:val="20"/>
+      <w:lang w:val="en-US"/>
     </w:rPr>
   </w:style>
   <w:style w:type="numbering" w:customStyle="1" w:styleId="Style1">
@@ -3577,6 +7138,15 @@
         <w:insideV w:val="single" w:sz="4" w:space="0" w:color="auto"/>
       </w:tblBorders>
     </w:tblPr>
+  </w:style>
+  <w:style w:type="paragraph" w:styleId="NoSpacing">
+    <w:name w:val="No Spacing"/>
+    <w:uiPriority w:val="1"/>
+    <w:qFormat/>
+    <w:rsid w:val="00055503"/>
+    <w:pPr>
+      <w:spacing w:after="0" w:line="240" w:lineRule="auto"/>
+    </w:pPr>
   </w:style>
 </w:styles>
 </file>
@@ -3874,4 +7444,16 @@
     </a:ext>
   </a:extLst>
 </a:theme>
+</file>
+
+<file path=customXml/item1.xml><?xml version="1.0" encoding="utf-8"?>
+<b:Sources xmlns:b="http://schemas.openxmlformats.org/officeDocument/2006/bibliography" xmlns="http://schemas.openxmlformats.org/officeDocument/2006/bibliography" SelectedStyle="\APASixthEditionOfficeOnline.xsl" StyleName="APA" Version="6"/>
+</file>
+
+<file path=customXml/itemProps1.xml><?xml version="1.0" encoding="utf-8"?>
+<ds:datastoreItem xmlns:ds="http://schemas.openxmlformats.org/officeDocument/2006/customXml" ds:itemID="{7E44C169-A9EA-4620-9A9C-5D36D0D2B3AF}">
+  <ds:schemaRefs>
+    <ds:schemaRef ds:uri="http://schemas.openxmlformats.org/officeDocument/2006/bibliography"/>
+  </ds:schemaRefs>
+</ds:datastoreItem>
 </file>
</xml_diff>